<commit_message>
Add simulations Q&A and I-don't-know answers to interview guide
Co-Authored-By: Claude Sonnet 5.5 <noreply@anthropic.com>
Claude-Session: https://claude.ai/code/session_01KhnAygruyT9oooR8C3iMXT
</commit_message>
<xml_diff>
--- a/docs/ACHERON_INTERVIEW_GUIDE.docx
+++ b/docs/ACHERON_INTERVIEW_GUIDE.docx
@@ -2,7 +2,7 @@
 <file path=word/document.xml><?xml version="1.0" encoding="utf-8"?>
 <w:document xmlns:w="http://schemas.openxmlformats.org/wordprocessingml/2006/main" xmlns:m="http://schemas.openxmlformats.org/officeDocument/2006/math" xmlns:r="http://schemas.openxmlformats.org/officeDocument/2006/relationships" xmlns:o="urn:schemas-microsoft-com:office:office" xmlns:v="urn:schemas-microsoft-com:vml" xmlns:w10="urn:schemas-microsoft-com:office:word" xmlns:a="http://schemas.openxmlformats.org/drawingml/2006/main" xmlns:pic="http://schemas.openxmlformats.org/drawingml/2006/picture" xmlns:wp="http://schemas.openxmlformats.org/drawingml/2006/wordprocessingDrawing">
   <w:body>
-    <w:bookmarkStart w:id="36" w:name="acheron-interview-guide"/>
+    <w:bookmarkStart w:id="37" w:name="acheron-interview-guide"/>
     <w:p>
       <w:pPr>
         <w:pStyle w:val="Heading1"/>
@@ -3954,13 +3954,25 @@
       </w:r>
     </w:p>
     <w:bookmarkEnd w:id="28"/>
-    <w:bookmarkStart w:id="29" w:name="Xbef7b9c84c60ec7b0f5f6ce6fd8bf952040dff2"/>
+    <w:bookmarkStart w:id="29" w:name="X5400ba72881644f210633f22f028ee8d96a0241"/>
     <w:p>
       <w:pPr>
         <w:pStyle w:val="Heading2"/>
       </w:pPr>
       <w:r>
-        <w:t xml:space="preserve">10. Never say</w:t>
+        <w:t xml:space="preserve">9b. The simulations, and five "I don't know" moments</w:t>
+      </w:r>
+    </w:p>
+    <w:p>
+      <w:pPr>
+        <w:pStyle w:val="FirstParagraph"/>
+      </w:pPr>
+      <w:r>
+        <w:rPr>
+          <w:bCs/>
+          <w:b/>
+        </w:rPr>
+        <w:t xml:space="preserve">"How did you code the simulations, and what are they based on?"</w:t>
       </w:r>
     </w:p>
     <w:p>
@@ -3972,7 +3984,7 @@
         <w:pStyle w:val="Compact"/>
       </w:pPr>
       <w:r>
-        <w:t xml:space="preserve">"Nobody has stored data as a bioelectric state." False since Yang 2020.</w:t>
+        <w:t xml:space="preserve">"They are Python with NumPy and SciPy. Each one takes an equation from a published paper, steps it forward in small time steps, and adds random noise."</w:t>
       </w:r>
     </w:p>
     <w:p>
@@ -3984,7 +3996,7 @@
         <w:pStyle w:val="Compact"/>
       </w:pPr>
       <w:r>
-        <w:t xml:space="preserve">"24 hours with under 1% error." Retired, zero-noise artefact.</w:t>
+        <w:t xml:space="preserve">"The toggle switch is Gardner et al. 2000. Uneven splitting at division is Huh and Paulsson 2011. The noise scaling check is Swain et al. 2002."</w:t>
       </w:r>
     </w:p>
     <w:p>
@@ -3996,79 +4008,286 @@
         <w:pStyle w:val="Compact"/>
       </w:pPr>
       <w:r>
-        <w:t xml:space="preserve">"Proven" about anything in</w:t>
-      </w:r>
-      <w:r>
-        <w:t xml:space="preserve"> </w:t>
-      </w:r>
-      <w:r>
-        <w:rPr>
-          <w:rStyle w:val="VerbatimChar"/>
-        </w:rPr>
-        <w:t xml:space="preserve">simulations/</w:t>
-      </w:r>
-      <w:r>
-        <w:t xml:space="preserve">. Say "simulated".</w:t>
-      </w:r>
-    </w:p>
-    <w:p>
-      <w:pPr>
-        <w:numPr>
-          <w:ilvl w:val="0"/>
-          <w:numId w:val="1005"/>
-        </w:numPr>
-        <w:pStyle w:val="Compact"/>
-      </w:pPr>
-      <w:r>
-        <w:t xml:space="preserve">"2% is the limit." It is the lowest level tested, not a measured limit.</w:t>
-      </w:r>
-    </w:p>
-    <w:p>
-      <w:pPr>
-        <w:numPr>
-          <w:ilvl w:val="0"/>
-          <w:numId w:val="1005"/>
-        </w:numPr>
-        <w:pStyle w:val="Compact"/>
-      </w:pPr>
-      <w:r>
-        <w:t xml:space="preserve">Any capacity, market size or lab cost for Experiments 2 to 7.</w:t>
-      </w:r>
-    </w:p>
-    <w:p>
-      <w:pPr>
-        <w:numPr>
-          <w:ilvl w:val="0"/>
-          <w:numId w:val="1005"/>
-        </w:numPr>
-        <w:pStyle w:val="Compact"/>
-      </w:pPr>
-      <w:r>
-        <w:t xml:space="preserve">That the patents were withdrawn or that the new drafts were filed.</w:t>
-      </w:r>
-    </w:p>
-    <w:p>
-      <w:pPr>
-        <w:numPr>
-          <w:ilvl w:val="0"/>
-          <w:numId w:val="1005"/>
-        </w:numPr>
-        <w:pStyle w:val="Compact"/>
-      </w:pPr>
-      <w:r>
-        <w:t xml:space="preserve">That a prototype or hardware exists.</w:t>
-      </w:r>
-    </w:p>
-    <w:p>
-      <w:pPr>
-        <w:numPr>
-          <w:ilvl w:val="0"/>
-          <w:numId w:val="1005"/>
-        </w:numPr>
-        <w:pStyle w:val="Compact"/>
-      </w:pPr>
-      <w:r>
-        <w:t xml:space="preserve">Em dashes in anything you send.</w:t>
+        <w:t xml:space="preserve">"I built them with AI coding help. I set the question, check the result against the paper, and log the limits in the audit." The repo history shows the commits authored by Claude, so never claim you hand-wrote everything.</w:t>
+      </w:r>
+    </w:p>
+    <w:p>
+      <w:pPr>
+        <w:pStyle w:val="FirstParagraph"/>
+      </w:pPr>
+      <w:r>
+        <w:t xml:space="preserve">Follow-ups:</w:t>
+      </w:r>
+    </w:p>
+    <w:p>
+      <w:pPr>
+        <w:numPr>
+          <w:ilvl w:val="0"/>
+          <w:numId w:val="1006"/>
+        </w:numPr>
+        <w:pStyle w:val="Compact"/>
+      </w:pPr>
+      <w:r>
+        <w:rPr>
+          <w:bCs/>
+          <w:b/>
+        </w:rPr>
+        <w:t xml:space="preserve">Are the numbers measured?</w:t>
+      </w:r>
+      <w:r>
+        <w:t xml:space="preserve"> </w:t>
+      </w:r>
+      <w:r>
+        <w:t xml:space="preserve">"Promoter strengths come from the Bacillus BioBrick Box. The noise levels are assumed and labelled that way. Experiments 2 and 4 replace them with measurements."</w:t>
+      </w:r>
+    </w:p>
+    <w:p>
+      <w:pPr>
+        <w:numPr>
+          <w:ilvl w:val="0"/>
+          <w:numId w:val="1006"/>
+        </w:numPr>
+        <w:pStyle w:val="Compact"/>
+      </w:pPr>
+      <w:r>
+        <w:rPr>
+          <w:bCs/>
+          <w:b/>
+        </w:rPr>
+        <w:t xml:space="preserve">Did you validate them?</w:t>
+      </w:r>
+      <w:r>
+        <w:t xml:space="preserve"> </w:t>
+      </w:r>
+      <w:r>
+        <w:t xml:space="preserve">"The 17 unit tests cover the analysis methods, checked against the original published code. The biology simulations have not been checked against lab data. That is what the wet lab is for."</w:t>
+      </w:r>
+    </w:p>
+    <w:p>
+      <w:pPr>
+        <w:numPr>
+          <w:ilvl w:val="0"/>
+          <w:numId w:val="1006"/>
+        </w:numPr>
+        <w:pStyle w:val="Compact"/>
+      </w:pPr>
+      <w:r>
+        <w:rPr>
+          <w:bCs/>
+          <w:b/>
+        </w:rPr>
+        <w:t xml:space="preserve">Why trust them?</w:t>
+      </w:r>
+      <w:r>
+        <w:t xml:space="preserve"> </w:t>
+      </w:r>
+      <w:r>
+        <w:t xml:space="preserve">"Don't. Fund the test that replaces them. One simulation already overturned our own first result, and it is documented."</w:t>
+      </w:r>
+    </w:p>
+    <w:p>
+      <w:pPr>
+        <w:numPr>
+          <w:ilvl w:val="0"/>
+          <w:numId w:val="1006"/>
+        </w:numPr>
+        <w:pStyle w:val="Compact"/>
+      </w:pPr>
+      <w:r>
+        <w:rPr>
+          <w:bCs/>
+          <w:b/>
+        </w:rPr>
+        <w:t xml:space="preserve">How many are there?</w:t>
+      </w:r>
+      <w:r>
+        <w:t xml:space="preserve"> </w:t>
+      </w:r>
+      <w:r>
+        <w:t xml:space="preserve">"About 40 simulation files in four tracks. Three carry the argument: the toggle switch, the colony regrowth, and the noise test that retired our first idea."</w:t>
+      </w:r>
+    </w:p>
+    <w:p>
+      <w:pPr>
+        <w:numPr>
+          <w:ilvl w:val="0"/>
+          <w:numId w:val="1006"/>
+        </w:numPr>
+        <w:pStyle w:val="Compact"/>
+      </w:pPr>
+      <w:r>
+        <w:rPr>
+          <w:bCs/>
+          <w:b/>
+        </w:rPr>
+        <w:t xml:space="preserve">Can experts check them?</w:t>
+      </w:r>
+      <w:r>
+        <w:t xml:space="preserve"> </w:t>
+      </w:r>
+      <w:r>
+        <w:t xml:space="preserve">"Yes. Every one is in the repo, and the audit says which parameters are published and which are assumed." (Confirm repo access before offering it, the repo is private.)</w:t>
+      </w:r>
+    </w:p>
+    <w:p>
+      <w:pPr>
+        <w:pStyle w:val="FirstParagraph"/>
+      </w:pPr>
+      <w:r>
+        <w:t xml:space="preserve">Do not say "all of them are based on real measured data." Some parameters are published measurements, but the noise magnitudes and the link from circuit to voltage are assumptions, and the audit says so.</w:t>
+      </w:r>
+    </w:p>
+    <w:p>
+      <w:pPr>
+        <w:pStyle w:val="BodyText"/>
+      </w:pPr>
+      <w:r>
+        <w:rPr>
+          <w:bCs/>
+          <w:b/>
+        </w:rPr>
+        <w:t xml:space="preserve">Five "I don't know" moments</w:t>
+      </w:r>
+    </w:p>
+    <w:p>
+      <w:pPr>
+        <w:numPr>
+          <w:ilvl w:val="0"/>
+          <w:numId w:val="1007"/>
+        </w:numPr>
+        <w:pStyle w:val="Compact"/>
+      </w:pPr>
+      <w:r>
+        <w:rPr>
+          <w:bCs/>
+          <w:b/>
+        </w:rPr>
+        <w:t xml:space="preserve">A specific number</w:t>
+      </w:r>
+      <w:r>
+        <w:t xml:space="preserve"> </w:t>
+      </w:r>
+      <w:r>
+        <w:t xml:space="preserve">(molecules per cell, voltage levels, memory capacity): "That isn't measured yet. In the simulation it is an assumption, and Experiment 4 measures it."</w:t>
+      </w:r>
+    </w:p>
+    <w:p>
+      <w:pPr>
+        <w:numPr>
+          <w:ilvl w:val="0"/>
+          <w:numId w:val="1007"/>
+        </w:numPr>
+        <w:pStyle w:val="Compact"/>
+      </w:pPr>
+      <w:r>
+        <w:rPr>
+          <w:bCs/>
+          <w:b/>
+        </w:rPr>
+        <w:t xml:space="preserve">Lab technique</w:t>
+      </w:r>
+      <w:r>
+        <w:t xml:space="preserve"> </w:t>
+      </w:r>
+      <w:r>
+        <w:t xml:space="preserve">(cloning steps, flow cytometry settings): "That is for the partner lab and the consultant we want to hire. I can tell you what the experiment must show, not how to run it."</w:t>
+      </w:r>
+    </w:p>
+    <w:p>
+      <w:pPr>
+        <w:numPr>
+          <w:ilvl w:val="0"/>
+          <w:numId w:val="1007"/>
+        </w:numPr>
+        <w:pStyle w:val="Compact"/>
+      </w:pPr>
+      <w:r>
+        <w:rPr>
+          <w:bCs/>
+          <w:b/>
+        </w:rPr>
+        <w:t xml:space="preserve">Why the yugO channel?</w:t>
+      </w:r>
+      <w:r>
+        <w:t xml:space="preserve"> </w:t>
+      </w:r>
+      <w:r>
+        <w:t xml:space="preserve">"It is the candidate channel from the literature (Lundberg et al. 2013). We found no published example of anyone wiring it to a genetic switch, and Experiment 5 tests that."</w:t>
+      </w:r>
+    </w:p>
+    <w:p>
+      <w:pPr>
+        <w:numPr>
+          <w:ilvl w:val="0"/>
+          <w:numId w:val="1007"/>
+        </w:numPr>
+        <w:pStyle w:val="Compact"/>
+      </w:pPr>
+      <w:r>
+        <w:rPr>
+          <w:bCs/>
+          <w:b/>
+        </w:rPr>
+        <w:t xml:space="preserve">Biosafety and regulation:</w:t>
+      </w:r>
+      <w:r>
+        <w:t xml:space="preserve"> </w:t>
+      </w:r>
+      <w:r>
+        <w:t xml:space="preserve">"</w:t>
+      </w:r>
+      <w:r>
+        <w:rPr>
+          <w:iCs/>
+          <w:i/>
+        </w:rPr>
+        <w:t xml:space="preserve">B. subtilis</w:t>
+      </w:r>
+      <w:r>
+        <w:t xml:space="preserve"> </w:t>
+      </w:r>
+      <w:r>
+        <w:t xml:space="preserve">is a common non-pathogenic lab organism. I would confirm the biosafety level with the partner lab and the institution before saying more."</w:t>
+      </w:r>
+    </w:p>
+    <w:p>
+      <w:pPr>
+        <w:numPr>
+          <w:ilvl w:val="0"/>
+          <w:numId w:val="1007"/>
+        </w:numPr>
+        <w:pStyle w:val="Compact"/>
+      </w:pPr>
+      <w:r>
+        <w:rPr>
+          <w:bCs/>
+          <w:b/>
+        </w:rPr>
+        <w:t xml:space="preserve">Market size or revenue:</w:t>
+      </w:r>
+      <w:r>
+        <w:t xml:space="preserve"> </w:t>
+      </w:r>
+      <w:r>
+        <w:t xml:space="preserve">"I don't have a validated number and I won't invent one. The reference points I trust are the CL-1 price and the analyst estimates for radiation-hardened space electronics."</w:t>
+      </w:r>
+    </w:p>
+    <w:p>
+      <w:pPr>
+        <w:pStyle w:val="FirstParagraph"/>
+      </w:pPr>
+      <w:r>
+        <w:rPr>
+          <w:bCs/>
+          <w:b/>
+        </w:rPr>
+        <w:t xml:space="preserve">General rule when you don't know:</w:t>
+      </w:r>
+      <w:r>
+        <w:t xml:space="preserve"> </w:t>
+      </w:r>
+      <w:r>
+        <w:t xml:space="preserve">"I don't know that yet, here is what I do know." Or: "I'd rather check than guess, I'll send you the answer with the source." Then send it. AI agreement is not verification: say you treat AI output as unverified until you have checked the paper. Your best proof is that you found a fabricated citation in a filed patent.</w:t>
       </w:r>
     </w:p>
     <w:p>
@@ -4079,7 +4298,132 @@
       </w:r>
     </w:p>
     <w:bookmarkEnd w:id="29"/>
-    <w:bookmarkStart w:id="30" w:name="X726d46773f6d87b70607ed8f9fb1c7d830c494d"/>
+    <w:bookmarkStart w:id="30" w:name="Xbef7b9c84c60ec7b0f5f6ce6fd8bf952040dff2"/>
+    <w:p>
+      <w:pPr>
+        <w:pStyle w:val="Heading2"/>
+      </w:pPr>
+      <w:r>
+        <w:t xml:space="preserve">10. Never say</w:t>
+      </w:r>
+    </w:p>
+    <w:p>
+      <w:pPr>
+        <w:numPr>
+          <w:ilvl w:val="0"/>
+          <w:numId w:val="1008"/>
+        </w:numPr>
+        <w:pStyle w:val="Compact"/>
+      </w:pPr>
+      <w:r>
+        <w:t xml:space="preserve">"Nobody has stored data as a bioelectric state." False since Yang 2020.</w:t>
+      </w:r>
+    </w:p>
+    <w:p>
+      <w:pPr>
+        <w:numPr>
+          <w:ilvl w:val="0"/>
+          <w:numId w:val="1008"/>
+        </w:numPr>
+        <w:pStyle w:val="Compact"/>
+      </w:pPr>
+      <w:r>
+        <w:t xml:space="preserve">"24 hours with under 1% error." Retired, zero-noise artefact.</w:t>
+      </w:r>
+    </w:p>
+    <w:p>
+      <w:pPr>
+        <w:numPr>
+          <w:ilvl w:val="0"/>
+          <w:numId w:val="1008"/>
+        </w:numPr>
+        <w:pStyle w:val="Compact"/>
+      </w:pPr>
+      <w:r>
+        <w:t xml:space="preserve">"Proven" about anything in</w:t>
+      </w:r>
+      <w:r>
+        <w:t xml:space="preserve"> </w:t>
+      </w:r>
+      <w:r>
+        <w:rPr>
+          <w:rStyle w:val="VerbatimChar"/>
+        </w:rPr>
+        <w:t xml:space="preserve">simulations/</w:t>
+      </w:r>
+      <w:r>
+        <w:t xml:space="preserve">. Say "simulated".</w:t>
+      </w:r>
+    </w:p>
+    <w:p>
+      <w:pPr>
+        <w:numPr>
+          <w:ilvl w:val="0"/>
+          <w:numId w:val="1008"/>
+        </w:numPr>
+        <w:pStyle w:val="Compact"/>
+      </w:pPr>
+      <w:r>
+        <w:t xml:space="preserve">"2% is the limit." It is the lowest level tested, not a measured limit.</w:t>
+      </w:r>
+    </w:p>
+    <w:p>
+      <w:pPr>
+        <w:numPr>
+          <w:ilvl w:val="0"/>
+          <w:numId w:val="1008"/>
+        </w:numPr>
+        <w:pStyle w:val="Compact"/>
+      </w:pPr>
+      <w:r>
+        <w:t xml:space="preserve">Any capacity, market size or lab cost for Experiments 2 to 7.</w:t>
+      </w:r>
+    </w:p>
+    <w:p>
+      <w:pPr>
+        <w:numPr>
+          <w:ilvl w:val="0"/>
+          <w:numId w:val="1008"/>
+        </w:numPr>
+        <w:pStyle w:val="Compact"/>
+      </w:pPr>
+      <w:r>
+        <w:t xml:space="preserve">That the patents were withdrawn or that the new drafts were filed.</w:t>
+      </w:r>
+    </w:p>
+    <w:p>
+      <w:pPr>
+        <w:numPr>
+          <w:ilvl w:val="0"/>
+          <w:numId w:val="1008"/>
+        </w:numPr>
+        <w:pStyle w:val="Compact"/>
+      </w:pPr>
+      <w:r>
+        <w:t xml:space="preserve">That a prototype or hardware exists.</w:t>
+      </w:r>
+    </w:p>
+    <w:p>
+      <w:pPr>
+        <w:numPr>
+          <w:ilvl w:val="0"/>
+          <w:numId w:val="1008"/>
+        </w:numPr>
+        <w:pStyle w:val="Compact"/>
+      </w:pPr>
+      <w:r>
+        <w:t xml:space="preserve">Em dashes in anything you send.</w:t>
+      </w:r>
+    </w:p>
+    <w:p>
+      <w:r>
+        <w:pict>
+          <v:rect style="width:0;height:1.5pt" o:hralign="center" o:hrstd="t" o:hr="t"/>
+        </w:pict>
+      </w:r>
+    </w:p>
+    <w:bookmarkEnd w:id="30"/>
+    <w:bookmarkStart w:id="31" w:name="X726d46773f6d87b70607ed8f9fb1c7d830c494d"/>
     <w:p>
       <w:pPr>
         <w:pStyle w:val="Heading2"/>
@@ -4454,8 +4798,8 @@
         </w:pict>
       </w:r>
     </w:p>
-    <w:bookmarkEnd w:id="30"/>
-    <w:bookmarkStart w:id="34" w:name="X0bc056492edbb8548de515718be6bda0ae3492a"/>
+    <w:bookmarkEnd w:id="31"/>
+    <w:bookmarkStart w:id="35" w:name="X0bc056492edbb8548de515718be6bda0ae3492a"/>
     <w:p>
       <w:pPr>
         <w:pStyle w:val="Heading2"/>
@@ -4506,7 +4850,7 @@
       <w:pPr>
         <w:numPr>
           <w:ilvl w:val="0"/>
-          <w:numId w:val="1006"/>
+          <w:numId w:val="1009"/>
         </w:numPr>
         <w:pStyle w:val="Compact"/>
       </w:pPr>
@@ -4524,7 +4868,7 @@
       <w:pPr>
         <w:numPr>
           <w:ilvl w:val="0"/>
-          <w:numId w:val="1006"/>
+          <w:numId w:val="1009"/>
         </w:numPr>
         <w:pStyle w:val="Compact"/>
       </w:pPr>
@@ -4542,7 +4886,7 @@
       <w:pPr>
         <w:numPr>
           <w:ilvl w:val="0"/>
-          <w:numId w:val="1006"/>
+          <w:numId w:val="1009"/>
         </w:numPr>
         <w:pStyle w:val="Compact"/>
       </w:pPr>
@@ -4582,7 +4926,7 @@
       <w:pPr>
         <w:numPr>
           <w:ilvl w:val="0"/>
-          <w:numId w:val="1007"/>
+          <w:numId w:val="1010"/>
         </w:numPr>
         <w:pStyle w:val="Compact"/>
       </w:pPr>
@@ -4600,7 +4944,7 @@
       <w:pPr>
         <w:numPr>
           <w:ilvl w:val="0"/>
-          <w:numId w:val="1007"/>
+          <w:numId w:val="1010"/>
         </w:numPr>
         <w:pStyle w:val="Compact"/>
       </w:pPr>
@@ -4612,7 +4956,7 @@
       <w:pPr>
         <w:numPr>
           <w:ilvl w:val="0"/>
-          <w:numId w:val="1007"/>
+          <w:numId w:val="1010"/>
         </w:numPr>
         <w:pStyle w:val="Compact"/>
       </w:pPr>
@@ -4622,7 +4966,7 @@
       <w:r>
         <w:t xml:space="preserve"> </w:t>
       </w:r>
-      <w:hyperlink r:id="rId31">
+      <w:hyperlink r:id="rId32">
         <w:r>
           <w:rPr>
             <w:rStyle w:val="Hyperlink"/>
@@ -4647,7 +4991,7 @@
       <w:pPr>
         <w:numPr>
           <w:ilvl w:val="0"/>
-          <w:numId w:val="1008"/>
+          <w:numId w:val="1011"/>
         </w:numPr>
         <w:pStyle w:val="Compact"/>
       </w:pPr>
@@ -4659,7 +5003,7 @@
       <w:pPr>
         <w:numPr>
           <w:ilvl w:val="0"/>
-          <w:numId w:val="1008"/>
+          <w:numId w:val="1011"/>
         </w:numPr>
         <w:pStyle w:val="Compact"/>
       </w:pPr>
@@ -4671,7 +5015,7 @@
       <w:pPr>
         <w:numPr>
           <w:ilvl w:val="0"/>
-          <w:numId w:val="1008"/>
+          <w:numId w:val="1011"/>
         </w:numPr>
         <w:pStyle w:val="Compact"/>
       </w:pPr>
@@ -4701,7 +5045,7 @@
       <w:pPr>
         <w:numPr>
           <w:ilvl w:val="0"/>
-          <w:numId w:val="1009"/>
+          <w:numId w:val="1012"/>
         </w:numPr>
         <w:pStyle w:val="Compact"/>
       </w:pPr>
@@ -4719,7 +5063,7 @@
       <w:pPr>
         <w:numPr>
           <w:ilvl w:val="0"/>
-          <w:numId w:val="1009"/>
+          <w:numId w:val="1012"/>
         </w:numPr>
         <w:pStyle w:val="Compact"/>
       </w:pPr>
@@ -4731,7 +5075,7 @@
       <w:pPr>
         <w:numPr>
           <w:ilvl w:val="0"/>
-          <w:numId w:val="1009"/>
+          <w:numId w:val="1012"/>
         </w:numPr>
         <w:pStyle w:val="Compact"/>
       </w:pPr>
@@ -4743,7 +5087,7 @@
       <w:pPr>
         <w:numPr>
           <w:ilvl w:val="0"/>
-          <w:numId w:val="1009"/>
+          <w:numId w:val="1012"/>
         </w:numPr>
         <w:pStyle w:val="Compact"/>
       </w:pPr>
@@ -4781,7 +5125,7 @@
       <w:pPr>
         <w:numPr>
           <w:ilvl w:val="0"/>
-          <w:numId w:val="1010"/>
+          <w:numId w:val="1013"/>
         </w:numPr>
         <w:pStyle w:val="Compact"/>
       </w:pPr>
@@ -4799,7 +5143,7 @@
       <w:pPr>
         <w:numPr>
           <w:ilvl w:val="0"/>
-          <w:numId w:val="1010"/>
+          <w:numId w:val="1013"/>
         </w:numPr>
         <w:pStyle w:val="Compact"/>
       </w:pPr>
@@ -4811,7 +5155,7 @@
       <w:pPr>
         <w:numPr>
           <w:ilvl w:val="0"/>
-          <w:numId w:val="1010"/>
+          <w:numId w:val="1013"/>
         </w:numPr>
         <w:pStyle w:val="Compact"/>
       </w:pPr>
@@ -4823,7 +5167,7 @@
       <w:pPr>
         <w:numPr>
           <w:ilvl w:val="0"/>
-          <w:numId w:val="1010"/>
+          <w:numId w:val="1013"/>
         </w:numPr>
         <w:pStyle w:val="Compact"/>
       </w:pPr>
@@ -4833,7 +5177,7 @@
       <w:r>
         <w:t xml:space="preserve"> </w:t>
       </w:r>
-      <w:hyperlink r:id="rId32">
+      <w:hyperlink r:id="rId33">
         <w:r>
           <w:rPr>
             <w:rStyle w:val="Hyperlink"/>
@@ -4858,7 +5202,7 @@
       <w:pPr>
         <w:numPr>
           <w:ilvl w:val="0"/>
-          <w:numId w:val="1011"/>
+          <w:numId w:val="1014"/>
         </w:numPr>
         <w:pStyle w:val="Compact"/>
       </w:pPr>
@@ -4880,7 +5224,7 @@
       <w:r>
         <w:t xml:space="preserve"> </w:t>
       </w:r>
-      <w:hyperlink r:id="rId33">
+      <w:hyperlink r:id="rId34">
         <w:r>
           <w:rPr>
             <w:rStyle w:val="Hyperlink"/>
@@ -4911,7 +5255,7 @@
       <w:pPr>
         <w:numPr>
           <w:ilvl w:val="0"/>
-          <w:numId w:val="1012"/>
+          <w:numId w:val="1015"/>
         </w:numPr>
         <w:pStyle w:val="Compact"/>
       </w:pPr>
@@ -4941,7 +5285,7 @@
       <w:pPr>
         <w:numPr>
           <w:ilvl w:val="0"/>
-          <w:numId w:val="1013"/>
+          <w:numId w:val="1016"/>
         </w:numPr>
         <w:pStyle w:val="Compact"/>
       </w:pPr>
@@ -4986,8 +5330,8 @@
         </w:pict>
       </w:r>
     </w:p>
-    <w:bookmarkEnd w:id="34"/>
-    <w:bookmarkStart w:id="35" w:name="Xfe20e0d0917bd277929d48cd776bf75a811f542"/>
+    <w:bookmarkEnd w:id="35"/>
+    <w:bookmarkStart w:id="36" w:name="Xfe20e0d0917bd277929d48cd776bf75a811f542"/>
     <w:p>
       <w:pPr>
         <w:pStyle w:val="Heading2"/>
@@ -5000,7 +5344,7 @@
       <w:pPr>
         <w:numPr>
           <w:ilvl w:val="0"/>
-          <w:numId w:val="1014"/>
+          <w:numId w:val="1017"/>
         </w:numPr>
         <w:pStyle w:val="Compact"/>
       </w:pPr>
@@ -5022,7 +5366,7 @@
       <w:pPr>
         <w:numPr>
           <w:ilvl w:val="0"/>
-          <w:numId w:val="1014"/>
+          <w:numId w:val="1017"/>
         </w:numPr>
         <w:pStyle w:val="Compact"/>
       </w:pPr>
@@ -5044,7 +5388,7 @@
       <w:pPr>
         <w:numPr>
           <w:ilvl w:val="0"/>
-          <w:numId w:val="1014"/>
+          <w:numId w:val="1017"/>
         </w:numPr>
         <w:pStyle w:val="Compact"/>
       </w:pPr>
@@ -5066,7 +5410,7 @@
       <w:pPr>
         <w:numPr>
           <w:ilvl w:val="0"/>
-          <w:numId w:val="1014"/>
+          <w:numId w:val="1017"/>
         </w:numPr>
         <w:pStyle w:val="Compact"/>
       </w:pPr>
@@ -5100,7 +5444,7 @@
       <w:pPr>
         <w:numPr>
           <w:ilvl w:val="0"/>
-          <w:numId w:val="1014"/>
+          <w:numId w:val="1017"/>
         </w:numPr>
         <w:pStyle w:val="Compact"/>
       </w:pPr>
@@ -5122,7 +5466,7 @@
       <w:pPr>
         <w:numPr>
           <w:ilvl w:val="0"/>
-          <w:numId w:val="1014"/>
+          <w:numId w:val="1017"/>
         </w:numPr>
         <w:pStyle w:val="Compact"/>
       </w:pPr>
@@ -5144,7 +5488,7 @@
       <w:pPr>
         <w:numPr>
           <w:ilvl w:val="0"/>
-          <w:numId w:val="1014"/>
+          <w:numId w:val="1017"/>
         </w:numPr>
         <w:pStyle w:val="Compact"/>
       </w:pPr>
@@ -5166,7 +5510,7 @@
       <w:pPr>
         <w:numPr>
           <w:ilvl w:val="0"/>
-          <w:numId w:val="1014"/>
+          <w:numId w:val="1017"/>
         </w:numPr>
         <w:pStyle w:val="Compact"/>
       </w:pPr>
@@ -5188,7 +5532,7 @@
       <w:pPr>
         <w:numPr>
           <w:ilvl w:val="0"/>
-          <w:numId w:val="1014"/>
+          <w:numId w:val="1017"/>
         </w:numPr>
         <w:pStyle w:val="Compact"/>
       </w:pPr>
@@ -5206,8 +5550,8 @@
         <w:t xml:space="preserve">a clean "no". Worth money because it saves money.</w:t>
       </w:r>
     </w:p>
-    <w:bookmarkEnd w:id="35"/>
     <w:bookmarkEnd w:id="36"/>
+    <w:bookmarkEnd w:id="37"/>
     <w:sectPr/>
   </w:body>
 </w:document>
@@ -5551,7 +5895,34 @@
     <w:abstractNumId w:val="991"/>
   </w:num>
   <w:num w:numId="1007">
-    <w:abstractNumId w:val="991"/>
+    <w:abstractNumId w:val="99411"/>
+    <w:lvlOverride w:ilvl="0">
+      <w:startOverride w:val="1"/>
+    </w:lvlOverride>
+    <w:lvlOverride w:ilvl="1">
+      <w:startOverride w:val="1"/>
+    </w:lvlOverride>
+    <w:lvlOverride w:ilvl="2">
+      <w:startOverride w:val="1"/>
+    </w:lvlOverride>
+    <w:lvlOverride w:ilvl="3">
+      <w:startOverride w:val="1"/>
+    </w:lvlOverride>
+    <w:lvlOverride w:ilvl="4">
+      <w:startOverride w:val="1"/>
+    </w:lvlOverride>
+    <w:lvlOverride w:ilvl="5">
+      <w:startOverride w:val="1"/>
+    </w:lvlOverride>
+    <w:lvlOverride w:ilvl="6">
+      <w:startOverride w:val="1"/>
+    </w:lvlOverride>
+    <w:lvlOverride w:ilvl="7">
+      <w:startOverride w:val="1"/>
+    </w:lvlOverride>
+    <w:lvlOverride w:ilvl="8">
+      <w:startOverride w:val="1"/>
+    </w:lvlOverride>
   </w:num>
   <w:num w:numId="1008">
     <w:abstractNumId w:val="991"/>
@@ -5572,6 +5943,15 @@
     <w:abstractNumId w:val="991"/>
   </w:num>
   <w:num w:numId="1014">
+    <w:abstractNumId w:val="991"/>
+  </w:num>
+  <w:num w:numId="1015">
+    <w:abstractNumId w:val="991"/>
+  </w:num>
+  <w:num w:numId="1016">
+    <w:abstractNumId w:val="991"/>
+  </w:num>
+  <w:num w:numId="1017">
     <w:abstractNumId w:val="991"/>
   </w:num>
 </w:numbering>

</xml_diff>

<commit_message>
Add yugO explanation to interview guide
Co-Authored-By: Claude Sonnet 5.5 <noreply@anthropic.com>
Claude-Session: https://claude.ai/code/session_01KhnAygruyT9oooR8C3iMXT
</commit_message>
<xml_diff>
--- a/docs/ACHERON_INTERVIEW_GUIDE.docx
+++ b/docs/ACHERON_INTERVIEW_GUIDE.docx
@@ -2,7 +2,7 @@
 <file path=word/document.xml><?xml version="1.0" encoding="utf-8"?>
 <w:document xmlns:w="http://schemas.openxmlformats.org/wordprocessingml/2006/main" xmlns:m="http://schemas.openxmlformats.org/officeDocument/2006/math" xmlns:r="http://schemas.openxmlformats.org/officeDocument/2006/relationships" xmlns:o="urn:schemas-microsoft-com:office:office" xmlns:v="urn:schemas-microsoft-com:vml" xmlns:w10="urn:schemas-microsoft-com:office:word" xmlns:a="http://schemas.openxmlformats.org/drawingml/2006/main" xmlns:pic="http://schemas.openxmlformats.org/drawingml/2006/picture" xmlns:wp="http://schemas.openxmlformats.org/drawingml/2006/wordprocessingDrawing">
   <w:body>
-    <w:bookmarkStart w:id="37" w:name="acheron-interview-guide"/>
+    <w:bookmarkStart w:id="38" w:name="acheron-interview-guide"/>
     <w:p>
       <w:pPr>
         <w:pStyle w:val="Heading1"/>
@@ -4298,13 +4298,25 @@
       </w:r>
     </w:p>
     <w:bookmarkEnd w:id="29"/>
-    <w:bookmarkStart w:id="30" w:name="Xbef7b9c84c60ec7b0f5f6ce6fd8bf952040dff2"/>
+    <w:bookmarkStart w:id="30" w:name="X7733ab87a12e9d405f7d4dcf7574c988c6e6c2f"/>
     <w:p>
       <w:pPr>
         <w:pStyle w:val="Heading2"/>
       </w:pPr>
       <w:r>
-        <w:t xml:space="preserve">10. Never say</w:t>
+        <w:t xml:space="preserve">9c. What is yugO, and why has no one wired it up?</w:t>
+      </w:r>
+    </w:p>
+    <w:p>
+      <w:pPr>
+        <w:pStyle w:val="FirstParagraph"/>
+      </w:pPr>
+      <w:r>
+        <w:rPr>
+          <w:bCs/>
+          <w:b/>
+        </w:rPr>
+        <w:t xml:space="preserve">What it is.</w:t>
       </w:r>
     </w:p>
     <w:p>
@@ -4316,7 +4328,20 @@
         <w:pStyle w:val="Compact"/>
       </w:pPr>
       <w:r>
-        <w:t xml:space="preserve">"Nobody has stored data as a bioelectric state." False since Yang 2020.</w:t>
+        <w:t xml:space="preserve">A potassium channel in</w:t>
+      </w:r>
+      <w:r>
+        <w:t xml:space="preserve"> </w:t>
+      </w:r>
+      <w:r>
+        <w:rPr>
+          <w:iCs/>
+          <w:i/>
+        </w:rPr>
+        <w:t xml:space="preserve">B. subtilis</w:t>
+      </w:r>
+      <w:r>
+        <w:t xml:space="preserve">, a protein gate that lets K+ leave the cell. That shifts the cell's voltage.</w:t>
       </w:r>
     </w:p>
     <w:p>
@@ -4328,7 +4353,7 @@
         <w:pStyle w:val="Compact"/>
       </w:pPr>
       <w:r>
-        <w:t xml:space="preserve">"24 hours with under 1% error." Retired, zero-noise artefact.</w:t>
+        <w:t xml:space="preserve">Identified by Lundberg, Becker and Choe (2013). It sits right after the mstX gene, and the biofilm master switch SinR turns it off.</w:t>
       </w:r>
     </w:p>
     <w:p>
@@ -4340,19 +4365,7 @@
         <w:pStyle w:val="Compact"/>
       </w:pPr>
       <w:r>
-        <w:t xml:space="preserve">"Proven" about anything in</w:t>
-      </w:r>
-      <w:r>
-        <w:t xml:space="preserve"> </w:t>
-      </w:r>
-      <w:r>
-        <w:rPr>
-          <w:rStyle w:val="VerbatimChar"/>
-        </w:rPr>
-        <w:t xml:space="preserve">simulations/</w:t>
-      </w:r>
-      <w:r>
-        <w:t xml:space="preserve">. Say "simulated".</w:t>
+        <w:t xml:space="preserve">When yugO is on, K+ leaving the cell sets off a loop that switches SinR off. So yugO both drives and responds to the cell's biofilm decision.</w:t>
       </w:r>
     </w:p>
     <w:p>
@@ -4364,55 +4377,153 @@
         <w:pStyle w:val="Compact"/>
       </w:pPr>
       <w:r>
-        <w:t xml:space="preserve">"2% is the limit." It is the lowest level tested, not a measured limit.</w:t>
-      </w:r>
-    </w:p>
-    <w:p>
-      <w:pPr>
-        <w:numPr>
-          <w:ilvl w:val="0"/>
-          <w:numId w:val="1008"/>
-        </w:numPr>
-        <w:pStyle w:val="Compact"/>
-      </w:pPr>
-      <w:r>
-        <w:t xml:space="preserve">Any capacity, market size or lab cost for Experiments 2 to 7.</w:t>
-      </w:r>
-    </w:p>
-    <w:p>
-      <w:pPr>
-        <w:numPr>
-          <w:ilvl w:val="0"/>
-          <w:numId w:val="1008"/>
-        </w:numPr>
-        <w:pStyle w:val="Compact"/>
-      </w:pPr>
-      <w:r>
-        <w:t xml:space="preserve">That the patents were withdrawn or that the new drafts were filed.</w:t>
-      </w:r>
-    </w:p>
-    <w:p>
-      <w:pPr>
-        <w:numPr>
-          <w:ilvl w:val="0"/>
-          <w:numId w:val="1008"/>
-        </w:numPr>
-        <w:pStyle w:val="Compact"/>
-      </w:pPr>
-      <w:r>
-        <w:t xml:space="preserve">That a prototype or hardware exists.</w:t>
-      </w:r>
-    </w:p>
-    <w:p>
-      <w:pPr>
-        <w:numPr>
-          <w:ilvl w:val="0"/>
-          <w:numId w:val="1008"/>
-        </w:numPr>
-        <w:pStyle w:val="Compact"/>
-      </w:pPr>
-      <w:r>
-        <w:t xml:space="preserve">Em dashes in anything you send.</w:t>
+        <w:t xml:space="preserve">Why it matters here: it is our candidate gate for turning the toggle's state into a measurable voltage (Experiment 5).</w:t>
+      </w:r>
+    </w:p>
+    <w:p>
+      <w:pPr>
+        <w:pStyle w:val="FirstParagraph"/>
+      </w:pPr>
+      <w:r>
+        <w:rPr>
+          <w:bCs/>
+          <w:b/>
+        </w:rPr>
+        <w:t xml:space="preserve">Why we found no one who wired it to a genetic switch.</w:t>
+      </w:r>
+      <w:r>
+        <w:t xml:space="preserve"> </w:t>
+      </w:r>
+      <w:r>
+        <w:t xml:space="preserve">Say "we found no published example." That is not the same as "none exists."</w:t>
+      </w:r>
+    </w:p>
+    <w:p>
+      <w:pPr>
+        <w:numPr>
+          <w:ilvl w:val="0"/>
+          <w:numId w:val="1009"/>
+        </w:numPr>
+        <w:pStyle w:val="Compact"/>
+      </w:pPr>
+      <w:r>
+        <w:rPr>
+          <w:bCs/>
+          <w:b/>
+        </w:rPr>
+        <w:t xml:space="preserve">Tangled in the cell's own loop.</w:t>
+      </w:r>
+      <w:r>
+        <w:t xml:space="preserve"> </w:t>
+      </w:r>
+      <w:r>
+        <w:t xml:space="preserve">Driving it from a synthetic toggle also pushes the biofilm network, so effects are hard to separate.</w:t>
+      </w:r>
+    </w:p>
+    <w:p>
+      <w:pPr>
+        <w:numPr>
+          <w:ilvl w:val="0"/>
+          <w:numId w:val="1009"/>
+        </w:numPr>
+        <w:pStyle w:val="Compact"/>
+      </w:pPr>
+      <w:r>
+        <w:rPr>
+          <w:bCs/>
+          <w:b/>
+        </w:rPr>
+        <w:t xml:space="preserve">Strain problem.</w:t>
+      </w:r>
+      <w:r>
+        <w:t xml:space="preserve"> </w:t>
+      </w:r>
+      <w:r>
+        <w:t xml:space="preserve">The biofilm-forming strain (3610) is hard to transform. The strain with measured parts (W168) does not form the biofilm.</w:t>
+      </w:r>
+    </w:p>
+    <w:p>
+      <w:pPr>
+        <w:numPr>
+          <w:ilvl w:val="0"/>
+          <w:numId w:val="1009"/>
+        </w:numPr>
+        <w:pStyle w:val="Compact"/>
+      </w:pPr>
+      <w:r>
+        <w:rPr>
+          <w:bCs/>
+          <w:b/>
+        </w:rPr>
+        <w:t xml:space="preserve">The colony's own potassium rhythm</w:t>
+      </w:r>
+      <w:r>
+        <w:t xml:space="preserve"> </w:t>
+      </w:r>
+      <w:r>
+        <w:t xml:space="preserve">corrupts voltage readings.</w:t>
+      </w:r>
+    </w:p>
+    <w:p>
+      <w:pPr>
+        <w:numPr>
+          <w:ilvl w:val="0"/>
+          <w:numId w:val="1009"/>
+        </w:numPr>
+        <w:pStyle w:val="Compact"/>
+      </w:pPr>
+      <w:r>
+        <w:rPr>
+          <w:bCs/>
+          <w:b/>
+        </w:rPr>
+        <w:t xml:space="preserve">No calibrated voltage in bacteria.</w:t>
+      </w:r>
+      <w:r>
+        <w:t xml:space="preserve"> </w:t>
+      </w:r>
+      <w:r>
+        <w:t xml:space="preserve">The common dye is not calibrated to millivolts and affects the cells it measures.</w:t>
+      </w:r>
+    </w:p>
+    <w:p>
+      <w:pPr>
+        <w:numPr>
+          <w:ilvl w:val="0"/>
+          <w:numId w:val="1009"/>
+        </w:numPr>
+        <w:pStyle w:val="Compact"/>
+      </w:pPr>
+      <w:r>
+        <w:rPr>
+          <w:bCs/>
+          <w:b/>
+        </w:rPr>
+        <w:t xml:space="preserve">Low incentive.</w:t>
+      </w:r>
+      <w:r>
+        <w:t xml:space="preserve"> </w:t>
+      </w:r>
+      <w:r>
+        <w:t xml:space="preserve">Most memory work in synthetic biology reads colour or DNA, not voltage.</w:t>
+      </w:r>
+    </w:p>
+    <w:p>
+      <w:pPr>
+        <w:pStyle w:val="FirstParagraph"/>
+      </w:pPr>
+      <w:r>
+        <w:rPr>
+          <w:bCs/>
+          <w:b/>
+        </w:rPr>
+        <w:t xml:space="preserve">Short answer for the room:</w:t>
+      </w:r>
+      <w:r>
+        <w:t xml:space="preserve"> </w:t>
+      </w:r>
+      <w:r>
+        <w:t xml:space="preserve">"It is the riskiest link in the project, which is why it comes after the cheaper experiments."</w:t>
       </w:r>
     </w:p>
     <w:p>
@@ -4423,7 +4534,132 @@
       </w:r>
     </w:p>
     <w:bookmarkEnd w:id="30"/>
-    <w:bookmarkStart w:id="31" w:name="X726d46773f6d87b70607ed8f9fb1c7d830c494d"/>
+    <w:bookmarkStart w:id="31" w:name="Xbef7b9c84c60ec7b0f5f6ce6fd8bf952040dff2"/>
+    <w:p>
+      <w:pPr>
+        <w:pStyle w:val="Heading2"/>
+      </w:pPr>
+      <w:r>
+        <w:t xml:space="preserve">10. Never say</w:t>
+      </w:r>
+    </w:p>
+    <w:p>
+      <w:pPr>
+        <w:numPr>
+          <w:ilvl w:val="0"/>
+          <w:numId w:val="1010"/>
+        </w:numPr>
+        <w:pStyle w:val="Compact"/>
+      </w:pPr>
+      <w:r>
+        <w:t xml:space="preserve">"Nobody has stored data as a bioelectric state." False since Yang 2020.</w:t>
+      </w:r>
+    </w:p>
+    <w:p>
+      <w:pPr>
+        <w:numPr>
+          <w:ilvl w:val="0"/>
+          <w:numId w:val="1010"/>
+        </w:numPr>
+        <w:pStyle w:val="Compact"/>
+      </w:pPr>
+      <w:r>
+        <w:t xml:space="preserve">"24 hours with under 1% error." Retired, zero-noise artefact.</w:t>
+      </w:r>
+    </w:p>
+    <w:p>
+      <w:pPr>
+        <w:numPr>
+          <w:ilvl w:val="0"/>
+          <w:numId w:val="1010"/>
+        </w:numPr>
+        <w:pStyle w:val="Compact"/>
+      </w:pPr>
+      <w:r>
+        <w:t xml:space="preserve">"Proven" about anything in</w:t>
+      </w:r>
+      <w:r>
+        <w:t xml:space="preserve"> </w:t>
+      </w:r>
+      <w:r>
+        <w:rPr>
+          <w:rStyle w:val="VerbatimChar"/>
+        </w:rPr>
+        <w:t xml:space="preserve">simulations/</w:t>
+      </w:r>
+      <w:r>
+        <w:t xml:space="preserve">. Say "simulated".</w:t>
+      </w:r>
+    </w:p>
+    <w:p>
+      <w:pPr>
+        <w:numPr>
+          <w:ilvl w:val="0"/>
+          <w:numId w:val="1010"/>
+        </w:numPr>
+        <w:pStyle w:val="Compact"/>
+      </w:pPr>
+      <w:r>
+        <w:t xml:space="preserve">"2% is the limit." It is the lowest level tested, not a measured limit.</w:t>
+      </w:r>
+    </w:p>
+    <w:p>
+      <w:pPr>
+        <w:numPr>
+          <w:ilvl w:val="0"/>
+          <w:numId w:val="1010"/>
+        </w:numPr>
+        <w:pStyle w:val="Compact"/>
+      </w:pPr>
+      <w:r>
+        <w:t xml:space="preserve">Any capacity, market size or lab cost for Experiments 2 to 7.</w:t>
+      </w:r>
+    </w:p>
+    <w:p>
+      <w:pPr>
+        <w:numPr>
+          <w:ilvl w:val="0"/>
+          <w:numId w:val="1010"/>
+        </w:numPr>
+        <w:pStyle w:val="Compact"/>
+      </w:pPr>
+      <w:r>
+        <w:t xml:space="preserve">That the patents were withdrawn or that the new drafts were filed.</w:t>
+      </w:r>
+    </w:p>
+    <w:p>
+      <w:pPr>
+        <w:numPr>
+          <w:ilvl w:val="0"/>
+          <w:numId w:val="1010"/>
+        </w:numPr>
+        <w:pStyle w:val="Compact"/>
+      </w:pPr>
+      <w:r>
+        <w:t xml:space="preserve">That a prototype or hardware exists.</w:t>
+      </w:r>
+    </w:p>
+    <w:p>
+      <w:pPr>
+        <w:numPr>
+          <w:ilvl w:val="0"/>
+          <w:numId w:val="1010"/>
+        </w:numPr>
+        <w:pStyle w:val="Compact"/>
+      </w:pPr>
+      <w:r>
+        <w:t xml:space="preserve">Em dashes in anything you send.</w:t>
+      </w:r>
+    </w:p>
+    <w:p>
+      <w:r>
+        <w:pict>
+          <v:rect style="width:0;height:1.5pt" o:hralign="center" o:hrstd="t" o:hr="t"/>
+        </w:pict>
+      </w:r>
+    </w:p>
+    <w:bookmarkEnd w:id="31"/>
+    <w:bookmarkStart w:id="32" w:name="X726d46773f6d87b70607ed8f9fb1c7d830c494d"/>
     <w:p>
       <w:pPr>
         <w:pStyle w:val="Heading2"/>
@@ -4798,8 +5034,8 @@
         </w:pict>
       </w:r>
     </w:p>
-    <w:bookmarkEnd w:id="31"/>
-    <w:bookmarkStart w:id="35" w:name="X0bc056492edbb8548de515718be6bda0ae3492a"/>
+    <w:bookmarkEnd w:id="32"/>
+    <w:bookmarkStart w:id="36" w:name="X0bc056492edbb8548de515718be6bda0ae3492a"/>
     <w:p>
       <w:pPr>
         <w:pStyle w:val="Heading2"/>
@@ -4850,7 +5086,7 @@
       <w:pPr>
         <w:numPr>
           <w:ilvl w:val="0"/>
-          <w:numId w:val="1009"/>
+          <w:numId w:val="1011"/>
         </w:numPr>
         <w:pStyle w:val="Compact"/>
       </w:pPr>
@@ -4868,7 +5104,7 @@
       <w:pPr>
         <w:numPr>
           <w:ilvl w:val="0"/>
-          <w:numId w:val="1009"/>
+          <w:numId w:val="1011"/>
         </w:numPr>
         <w:pStyle w:val="Compact"/>
       </w:pPr>
@@ -4886,7 +5122,7 @@
       <w:pPr>
         <w:numPr>
           <w:ilvl w:val="0"/>
-          <w:numId w:val="1009"/>
+          <w:numId w:val="1011"/>
         </w:numPr>
         <w:pStyle w:val="Compact"/>
       </w:pPr>
@@ -4926,7 +5162,7 @@
       <w:pPr>
         <w:numPr>
           <w:ilvl w:val="0"/>
-          <w:numId w:val="1010"/>
+          <w:numId w:val="1012"/>
         </w:numPr>
         <w:pStyle w:val="Compact"/>
       </w:pPr>
@@ -4944,7 +5180,7 @@
       <w:pPr>
         <w:numPr>
           <w:ilvl w:val="0"/>
-          <w:numId w:val="1010"/>
+          <w:numId w:val="1012"/>
         </w:numPr>
         <w:pStyle w:val="Compact"/>
       </w:pPr>
@@ -4956,7 +5192,7 @@
       <w:pPr>
         <w:numPr>
           <w:ilvl w:val="0"/>
-          <w:numId w:val="1010"/>
+          <w:numId w:val="1012"/>
         </w:numPr>
         <w:pStyle w:val="Compact"/>
       </w:pPr>
@@ -4966,7 +5202,7 @@
       <w:r>
         <w:t xml:space="preserve"> </w:t>
       </w:r>
-      <w:hyperlink r:id="rId32">
+      <w:hyperlink r:id="rId33">
         <w:r>
           <w:rPr>
             <w:rStyle w:val="Hyperlink"/>
@@ -4991,7 +5227,7 @@
       <w:pPr>
         <w:numPr>
           <w:ilvl w:val="0"/>
-          <w:numId w:val="1011"/>
+          <w:numId w:val="1013"/>
         </w:numPr>
         <w:pStyle w:val="Compact"/>
       </w:pPr>
@@ -5003,7 +5239,7 @@
       <w:pPr>
         <w:numPr>
           <w:ilvl w:val="0"/>
-          <w:numId w:val="1011"/>
+          <w:numId w:val="1013"/>
         </w:numPr>
         <w:pStyle w:val="Compact"/>
       </w:pPr>
@@ -5015,7 +5251,7 @@
       <w:pPr>
         <w:numPr>
           <w:ilvl w:val="0"/>
-          <w:numId w:val="1011"/>
+          <w:numId w:val="1013"/>
         </w:numPr>
         <w:pStyle w:val="Compact"/>
       </w:pPr>
@@ -5045,7 +5281,7 @@
       <w:pPr>
         <w:numPr>
           <w:ilvl w:val="0"/>
-          <w:numId w:val="1012"/>
+          <w:numId w:val="1014"/>
         </w:numPr>
         <w:pStyle w:val="Compact"/>
       </w:pPr>
@@ -5063,7 +5299,7 @@
       <w:pPr>
         <w:numPr>
           <w:ilvl w:val="0"/>
-          <w:numId w:val="1012"/>
+          <w:numId w:val="1014"/>
         </w:numPr>
         <w:pStyle w:val="Compact"/>
       </w:pPr>
@@ -5075,7 +5311,7 @@
       <w:pPr>
         <w:numPr>
           <w:ilvl w:val="0"/>
-          <w:numId w:val="1012"/>
+          <w:numId w:val="1014"/>
         </w:numPr>
         <w:pStyle w:val="Compact"/>
       </w:pPr>
@@ -5087,7 +5323,7 @@
       <w:pPr>
         <w:numPr>
           <w:ilvl w:val="0"/>
-          <w:numId w:val="1012"/>
+          <w:numId w:val="1014"/>
         </w:numPr>
         <w:pStyle w:val="Compact"/>
       </w:pPr>
@@ -5125,7 +5361,7 @@
       <w:pPr>
         <w:numPr>
           <w:ilvl w:val="0"/>
-          <w:numId w:val="1013"/>
+          <w:numId w:val="1015"/>
         </w:numPr>
         <w:pStyle w:val="Compact"/>
       </w:pPr>
@@ -5143,7 +5379,7 @@
       <w:pPr>
         <w:numPr>
           <w:ilvl w:val="0"/>
-          <w:numId w:val="1013"/>
+          <w:numId w:val="1015"/>
         </w:numPr>
         <w:pStyle w:val="Compact"/>
       </w:pPr>
@@ -5155,7 +5391,7 @@
       <w:pPr>
         <w:numPr>
           <w:ilvl w:val="0"/>
-          <w:numId w:val="1013"/>
+          <w:numId w:val="1015"/>
         </w:numPr>
         <w:pStyle w:val="Compact"/>
       </w:pPr>
@@ -5167,7 +5403,7 @@
       <w:pPr>
         <w:numPr>
           <w:ilvl w:val="0"/>
-          <w:numId w:val="1013"/>
+          <w:numId w:val="1015"/>
         </w:numPr>
         <w:pStyle w:val="Compact"/>
       </w:pPr>
@@ -5177,7 +5413,7 @@
       <w:r>
         <w:t xml:space="preserve"> </w:t>
       </w:r>
-      <w:hyperlink r:id="rId33">
+      <w:hyperlink r:id="rId34">
         <w:r>
           <w:rPr>
             <w:rStyle w:val="Hyperlink"/>
@@ -5202,7 +5438,7 @@
       <w:pPr>
         <w:numPr>
           <w:ilvl w:val="0"/>
-          <w:numId w:val="1014"/>
+          <w:numId w:val="1016"/>
         </w:numPr>
         <w:pStyle w:val="Compact"/>
       </w:pPr>
@@ -5224,7 +5460,7 @@
       <w:r>
         <w:t xml:space="preserve"> </w:t>
       </w:r>
-      <w:hyperlink r:id="rId34">
+      <w:hyperlink r:id="rId35">
         <w:r>
           <w:rPr>
             <w:rStyle w:val="Hyperlink"/>
@@ -5255,7 +5491,7 @@
       <w:pPr>
         <w:numPr>
           <w:ilvl w:val="0"/>
-          <w:numId w:val="1015"/>
+          <w:numId w:val="1017"/>
         </w:numPr>
         <w:pStyle w:val="Compact"/>
       </w:pPr>
@@ -5285,7 +5521,7 @@
       <w:pPr>
         <w:numPr>
           <w:ilvl w:val="0"/>
-          <w:numId w:val="1016"/>
+          <w:numId w:val="1018"/>
         </w:numPr>
         <w:pStyle w:val="Compact"/>
       </w:pPr>
@@ -5330,8 +5566,8 @@
         </w:pict>
       </w:r>
     </w:p>
-    <w:bookmarkEnd w:id="35"/>
-    <w:bookmarkStart w:id="36" w:name="Xfe20e0d0917bd277929d48cd776bf75a811f542"/>
+    <w:bookmarkEnd w:id="36"/>
+    <w:bookmarkStart w:id="37" w:name="Xfe20e0d0917bd277929d48cd776bf75a811f542"/>
     <w:p>
       <w:pPr>
         <w:pStyle w:val="Heading2"/>
@@ -5344,7 +5580,7 @@
       <w:pPr>
         <w:numPr>
           <w:ilvl w:val="0"/>
-          <w:numId w:val="1017"/>
+          <w:numId w:val="1019"/>
         </w:numPr>
         <w:pStyle w:val="Compact"/>
       </w:pPr>
@@ -5366,7 +5602,7 @@
       <w:pPr>
         <w:numPr>
           <w:ilvl w:val="0"/>
-          <w:numId w:val="1017"/>
+          <w:numId w:val="1019"/>
         </w:numPr>
         <w:pStyle w:val="Compact"/>
       </w:pPr>
@@ -5388,7 +5624,7 @@
       <w:pPr>
         <w:numPr>
           <w:ilvl w:val="0"/>
-          <w:numId w:val="1017"/>
+          <w:numId w:val="1019"/>
         </w:numPr>
         <w:pStyle w:val="Compact"/>
       </w:pPr>
@@ -5410,7 +5646,7 @@
       <w:pPr>
         <w:numPr>
           <w:ilvl w:val="0"/>
-          <w:numId w:val="1017"/>
+          <w:numId w:val="1019"/>
         </w:numPr>
         <w:pStyle w:val="Compact"/>
       </w:pPr>
@@ -5444,7 +5680,7 @@
       <w:pPr>
         <w:numPr>
           <w:ilvl w:val="0"/>
-          <w:numId w:val="1017"/>
+          <w:numId w:val="1019"/>
         </w:numPr>
         <w:pStyle w:val="Compact"/>
       </w:pPr>
@@ -5466,7 +5702,7 @@
       <w:pPr>
         <w:numPr>
           <w:ilvl w:val="0"/>
-          <w:numId w:val="1017"/>
+          <w:numId w:val="1019"/>
         </w:numPr>
         <w:pStyle w:val="Compact"/>
       </w:pPr>
@@ -5488,7 +5724,7 @@
       <w:pPr>
         <w:numPr>
           <w:ilvl w:val="0"/>
-          <w:numId w:val="1017"/>
+          <w:numId w:val="1019"/>
         </w:numPr>
         <w:pStyle w:val="Compact"/>
       </w:pPr>
@@ -5510,7 +5746,7 @@
       <w:pPr>
         <w:numPr>
           <w:ilvl w:val="0"/>
-          <w:numId w:val="1017"/>
+          <w:numId w:val="1019"/>
         </w:numPr>
         <w:pStyle w:val="Compact"/>
       </w:pPr>
@@ -5532,7 +5768,7 @@
       <w:pPr>
         <w:numPr>
           <w:ilvl w:val="0"/>
-          <w:numId w:val="1017"/>
+          <w:numId w:val="1019"/>
         </w:numPr>
         <w:pStyle w:val="Compact"/>
       </w:pPr>
@@ -5550,8 +5786,8 @@
         <w:t xml:space="preserve">a clean "no". Worth money because it saves money.</w:t>
       </w:r>
     </w:p>
-    <w:bookmarkEnd w:id="36"/>
     <w:bookmarkEnd w:id="37"/>
+    <w:bookmarkEnd w:id="38"/>
     <w:sectPr/>
   </w:body>
 </w:document>
@@ -5928,7 +6164,34 @@
     <w:abstractNumId w:val="991"/>
   </w:num>
   <w:num w:numId="1009">
-    <w:abstractNumId w:val="991"/>
+    <w:abstractNumId w:val="99411"/>
+    <w:lvlOverride w:ilvl="0">
+      <w:startOverride w:val="1"/>
+    </w:lvlOverride>
+    <w:lvlOverride w:ilvl="1">
+      <w:startOverride w:val="1"/>
+    </w:lvlOverride>
+    <w:lvlOverride w:ilvl="2">
+      <w:startOverride w:val="1"/>
+    </w:lvlOverride>
+    <w:lvlOverride w:ilvl="3">
+      <w:startOverride w:val="1"/>
+    </w:lvlOverride>
+    <w:lvlOverride w:ilvl="4">
+      <w:startOverride w:val="1"/>
+    </w:lvlOverride>
+    <w:lvlOverride w:ilvl="5">
+      <w:startOverride w:val="1"/>
+    </w:lvlOverride>
+    <w:lvlOverride w:ilvl="6">
+      <w:startOverride w:val="1"/>
+    </w:lvlOverride>
+    <w:lvlOverride w:ilvl="7">
+      <w:startOverride w:val="1"/>
+    </w:lvlOverride>
+    <w:lvlOverride w:ilvl="8">
+      <w:startOverride w:val="1"/>
+    </w:lvlOverride>
   </w:num>
   <w:num w:numId="1010">
     <w:abstractNumId w:val="991"/>
@@ -5952,6 +6215,12 @@
     <w:abstractNumId w:val="991"/>
   </w:num>
   <w:num w:numId="1017">
+    <w:abstractNumId w:val="991"/>
+  </w:num>
+  <w:num w:numId="1018">
+    <w:abstractNumId w:val="991"/>
+  </w:num>
+  <w:num w:numId="1019">
     <w:abstractNumId w:val="991"/>
   </w:num>
 </w:numbering>

</xml_diff>

<commit_message>
Add one-page cheat sheet and start-to-finish Acheron explanation to interview guide
Co-Authored-By: Claude Sonnet 5.5 <noreply@anthropic.com>
Claude-Session: https://claude.ai/code/session_01KhnAygruyT9oooR8C3iMXT
</commit_message>
<xml_diff>
--- a/docs/ACHERON_INTERVIEW_GUIDE.docx
+++ b/docs/ACHERON_INTERVIEW_GUIDE.docx
@@ -2,7 +2,7 @@
 <file path=word/document.xml><?xml version="1.0" encoding="utf-8"?>
 <w:document xmlns:w="http://schemas.openxmlformats.org/wordprocessingml/2006/main" xmlns:m="http://schemas.openxmlformats.org/officeDocument/2006/math" xmlns:r="http://schemas.openxmlformats.org/officeDocument/2006/relationships" xmlns:o="urn:schemas-microsoft-com:office:office" xmlns:v="urn:schemas-microsoft-com:vml" xmlns:w10="urn:schemas-microsoft-com:office:word" xmlns:a="http://schemas.openxmlformats.org/drawingml/2006/main" xmlns:pic="http://schemas.openxmlformats.org/drawingml/2006/picture" xmlns:wp="http://schemas.openxmlformats.org/drawingml/2006/wordprocessingDrawing">
   <w:body>
-    <w:bookmarkStart w:id="38" w:name="acheron-interview-guide"/>
+    <w:bookmarkStart w:id="39" w:name="acheron-interview-guide"/>
     <w:p>
       <w:pPr>
         <w:pStyle w:val="Heading1"/>
@@ -1073,7 +1073,499 @@
       </w:r>
     </w:p>
     <w:bookmarkEnd w:id="22"/>
-    <w:bookmarkStart w:id="23" w:name="X6db03ac23b62fa02018bb6051eb1cd7f92faab0"/>
+    <w:bookmarkStart w:id="23" w:name="Xcf73a1bd73db205ca998894e5c41251bb4a56af"/>
+    <w:p>
+      <w:pPr>
+        <w:pStyle w:val="Heading2"/>
+      </w:pPr>
+      <w:r>
+        <w:t xml:space="preserve">3b. Acheron start to finish, using only the words above</w:t>
+      </w:r>
+    </w:p>
+    <w:p>
+      <w:pPr>
+        <w:pStyle w:val="FirstParagraph"/>
+      </w:pPr>
+      <w:r>
+        <w:t xml:space="preserve">Read this aloud until it flows. Every bold word is one from section 3.</w:t>
+      </w:r>
+    </w:p>
+    <w:p>
+      <w:pPr>
+        <w:pStyle w:val="BodyText"/>
+      </w:pPr>
+      <w:r>
+        <w:rPr>
+          <w:bCs/>
+          <w:b/>
+        </w:rPr>
+        <w:t xml:space="preserve">1. The question.</w:t>
+      </w:r>
+      <w:r>
+        <w:t xml:space="preserve"> </w:t>
+      </w:r>
+      <w:r>
+        <w:t xml:space="preserve">A</w:t>
+      </w:r>
+      <w:r>
+        <w:t xml:space="preserve"> </w:t>
+      </w:r>
+      <w:r>
+        <w:rPr>
+          <w:bCs/>
+          <w:b/>
+        </w:rPr>
+        <w:t xml:space="preserve">cell</w:t>
+      </w:r>
+      <w:r>
+        <w:t xml:space="preserve"> </w:t>
+      </w:r>
+      <w:r>
+        <w:t xml:space="preserve">is a sealed bag of chemistry. We ask: can a living cell hold one bit, a 0 or a 1, survive being badly damaged, and still have that bit after it grows back? Nobody has tested that in any organism.</w:t>
+      </w:r>
+    </w:p>
+    <w:p>
+      <w:pPr>
+        <w:pStyle w:val="BodyText"/>
+      </w:pPr>
+      <w:r>
+        <w:rPr>
+          <w:bCs/>
+          <w:b/>
+        </w:rPr>
+        <w:t xml:space="preserve">2. The organism.</w:t>
+      </w:r>
+      <w:r>
+        <w:t xml:space="preserve"> </w:t>
+      </w:r>
+      <w:r>
+        <w:t xml:space="preserve">We start with a</w:t>
+      </w:r>
+      <w:r>
+        <w:t xml:space="preserve"> </w:t>
+      </w:r>
+      <w:r>
+        <w:rPr>
+          <w:bCs/>
+          <w:b/>
+        </w:rPr>
+        <w:t xml:space="preserve">bacterium</w:t>
+      </w:r>
+      <w:r>
+        <w:t xml:space="preserve">, a one-room cell that is simple, fast and easy to rewire. Specifically</w:t>
+      </w:r>
+      <w:r>
+        <w:t xml:space="preserve"> </w:t>
+      </w:r>
+      <w:r>
+        <w:rPr>
+          <w:bCs/>
+          <w:b/>
+          <w:iCs/>
+          <w:i/>
+        </w:rPr>
+        <w:t xml:space="preserve">B. subtilis</w:t>
+      </w:r>
+      <w:r>
+        <w:t xml:space="preserve">, a harmless soil bacterium. It is one of the best-studied bacteria, so the tools and parts already exist. The idea itself is not tied to one organism. Planaria are the longer-term target, but bacteria are cheaper and faster to test first.</w:t>
+      </w:r>
+    </w:p>
+    <w:p>
+      <w:pPr>
+        <w:pStyle w:val="BodyText"/>
+      </w:pPr>
+      <w:r>
+        <w:rPr>
+          <w:bCs/>
+          <w:b/>
+        </w:rPr>
+        <w:t xml:space="preserve">3. How a cell can hold a bit.</w:t>
+      </w:r>
+      <w:r>
+        <w:t xml:space="preserve"> </w:t>
+      </w:r>
+      <w:r>
+        <w:rPr>
+          <w:bCs/>
+          <w:b/>
+        </w:rPr>
+        <w:t xml:space="preserve">DNA</w:t>
+      </w:r>
+      <w:r>
+        <w:t xml:space="preserve"> </w:t>
+      </w:r>
+      <w:r>
+        <w:t xml:space="preserve">is the recipe book and a</w:t>
+      </w:r>
+      <w:r>
+        <w:t xml:space="preserve"> </w:t>
+      </w:r>
+      <w:r>
+        <w:rPr>
+          <w:bCs/>
+          <w:b/>
+        </w:rPr>
+        <w:t xml:space="preserve">gene</w:t>
+      </w:r>
+      <w:r>
+        <w:t xml:space="preserve"> </w:t>
+      </w:r>
+      <w:r>
+        <w:t xml:space="preserve">is one recipe. A gene builds one</w:t>
+      </w:r>
+      <w:r>
+        <w:t xml:space="preserve"> </w:t>
+      </w:r>
+      <w:r>
+        <w:rPr>
+          <w:bCs/>
+          <w:b/>
+        </w:rPr>
+        <w:t xml:space="preserve">protein</w:t>
+      </w:r>
+      <w:r>
+        <w:t xml:space="preserve">, the worker. A</w:t>
+      </w:r>
+      <w:r>
+        <w:t xml:space="preserve"> </w:t>
+      </w:r>
+      <w:r>
+        <w:rPr>
+          <w:bCs/>
+          <w:b/>
+        </w:rPr>
+        <w:t xml:space="preserve">promoter</w:t>
+      </w:r>
+      <w:r>
+        <w:t xml:space="preserve"> </w:t>
+      </w:r>
+      <w:r>
+        <w:t xml:space="preserve">is a volume knob in front of the gene that sets how often it is read. A</w:t>
+      </w:r>
+      <w:r>
+        <w:t xml:space="preserve"> </w:t>
+      </w:r>
+      <w:r>
+        <w:rPr>
+          <w:bCs/>
+          <w:b/>
+        </w:rPr>
+        <w:t xml:space="preserve">repressor</w:t>
+      </w:r>
+      <w:r>
+        <w:t xml:space="preserve"> </w:t>
+      </w:r>
+      <w:r>
+        <w:t xml:space="preserve">is a protein that mutes another gene's promoter. Now wire two genes so each one's repressor mutes the other. That is a</w:t>
+      </w:r>
+      <w:r>
+        <w:t xml:space="preserve"> </w:t>
+      </w:r>
+      <w:r>
+        <w:rPr>
+          <w:bCs/>
+          <w:b/>
+        </w:rPr>
+        <w:t xml:space="preserve">toggle switch</w:t>
+      </w:r>
+      <w:r>
+        <w:t xml:space="preserve">, and it is</w:t>
+      </w:r>
+      <w:r>
+        <w:t xml:space="preserve"> </w:t>
+      </w:r>
+      <w:r>
+        <w:rPr>
+          <w:bCs/>
+          <w:b/>
+        </w:rPr>
+        <w:t xml:space="preserve">bistable</w:t>
+      </w:r>
+      <w:r>
+        <w:t xml:space="preserve">: it rests in one of two states, like a light switch, not a dimmer. Repressor A winning is a 0. Repressor B winning is a 1. That is our bit.</w:t>
+      </w:r>
+    </w:p>
+    <w:p>
+      <w:pPr>
+        <w:pStyle w:val="BodyText"/>
+      </w:pPr>
+      <w:r>
+        <w:rPr>
+          <w:bCs/>
+          <w:b/>
+        </w:rPr>
+        <w:t xml:space="preserve">4. Why it can survive damage.</w:t>
+      </w:r>
+      <w:r>
+        <w:t xml:space="preserve"> </w:t>
+      </w:r>
+      <w:r>
+        <w:t xml:space="preserve">When a cell divides, the repressor proteins that hold the state go into both daughter cells. So if most of a colony dies, the survivors copy the state into every new cell as they regrow. This comes from how division works, not from an assumption. That is the property that separates us from earlier work.</w:t>
+      </w:r>
+    </w:p>
+    <w:p>
+      <w:pPr>
+        <w:pStyle w:val="BodyText"/>
+      </w:pPr>
+      <w:r>
+        <w:rPr>
+          <w:bCs/>
+          <w:b/>
+        </w:rPr>
+        <w:t xml:space="preserve">5. How we read it.</w:t>
+      </w:r>
+      <w:r>
+        <w:t xml:space="preserve"> </w:t>
+      </w:r>
+      <w:r>
+        <w:t xml:space="preserve">First with a</w:t>
+      </w:r>
+      <w:r>
+        <w:t xml:space="preserve"> </w:t>
+      </w:r>
+      <w:r>
+        <w:rPr>
+          <w:bCs/>
+          <w:b/>
+        </w:rPr>
+        <w:t xml:space="preserve">reporter</w:t>
+      </w:r>
+      <w:r>
+        <w:t xml:space="preserve">, a gene that makes a colour, like a mood ring. You see the switch state without a voltmeter. Later we want to read it as a voltage. A</w:t>
+      </w:r>
+      <w:r>
+        <w:t xml:space="preserve"> </w:t>
+      </w:r>
+      <w:r>
+        <w:rPr>
+          <w:bCs/>
+          <w:b/>
+        </w:rPr>
+        <w:t xml:space="preserve">membrane potential</w:t>
+      </w:r>
+      <w:r>
+        <w:t xml:space="preserve"> </w:t>
+      </w:r>
+      <w:r>
+        <w:t xml:space="preserve">is the voltage across the cell wall, created by different</w:t>
+      </w:r>
+      <w:r>
+        <w:t xml:space="preserve"> </w:t>
+      </w:r>
+      <w:r>
+        <w:rPr>
+          <w:bCs/>
+          <w:b/>
+        </w:rPr>
+        <w:t xml:space="preserve">ion</w:t>
+      </w:r>
+      <w:r>
+        <w:t xml:space="preserve"> </w:t>
+      </w:r>
+      <w:r>
+        <w:t xml:space="preserve">counts inside and outside. An</w:t>
+      </w:r>
+      <w:r>
+        <w:t xml:space="preserve"> </w:t>
+      </w:r>
+      <w:r>
+        <w:rPr>
+          <w:bCs/>
+          <w:b/>
+        </w:rPr>
+        <w:t xml:space="preserve">ion channel</w:t>
+      </w:r>
+      <w:r>
+        <w:t xml:space="preserve"> </w:t>
+      </w:r>
+      <w:r>
+        <w:t xml:space="preserve">is a protein door that lets one kind of ion through, and a pump pushes ions uphill using energy. Our candidate door is</w:t>
+      </w:r>
+      <w:r>
+        <w:t xml:space="preserve"> </w:t>
+      </w:r>
+      <w:r>
+        <w:rPr>
+          <w:bCs/>
+          <w:b/>
+        </w:rPr>
+        <w:t xml:space="preserve">yugO</w:t>
+      </w:r>
+      <w:r>
+        <w:t xml:space="preserve">, a potassium channel. The idea is that the toggle opens or closes yugO, K+ leaks out, and the voltage changes. Nobody has built that link in any organism. It is the riskiest part.</w:t>
+      </w:r>
+    </w:p>
+    <w:p>
+      <w:pPr>
+        <w:pStyle w:val="BodyText"/>
+      </w:pPr>
+      <w:r>
+        <w:rPr>
+          <w:bCs/>
+          <w:b/>
+        </w:rPr>
+        <w:t xml:space="preserve">6. How we tested it, in simulation.</w:t>
+      </w:r>
+      <w:r>
+        <w:t xml:space="preserve"> </w:t>
+      </w:r>
+      <w:r>
+        <w:t xml:space="preserve">Everything so far is a simulation, not a lab result.</w:t>
+      </w:r>
+    </w:p>
+    <w:p>
+      <w:pPr>
+        <w:numPr>
+          <w:ilvl w:val="0"/>
+          <w:numId w:val="1002"/>
+        </w:numPr>
+        <w:pStyle w:val="Compact"/>
+      </w:pPr>
+      <w:r>
+        <w:t xml:space="preserve">Our first idea was a voltage held passively in flatworm tissue. It looked perfect with no noise. With realistic noise it fell to a coin flip, about 50%. We published that and changed direction.</w:t>
+      </w:r>
+    </w:p>
+    <w:p>
+      <w:pPr>
+        <w:numPr>
+          <w:ilvl w:val="0"/>
+          <w:numId w:val="1002"/>
+        </w:numPr>
+        <w:pStyle w:val="Compact"/>
+      </w:pPr>
+      <w:r>
+        <w:t xml:space="preserve">We moved to the toggle switch. The simulation found a hard rule: the two promoters must be matched in strength, or the switch collapses into one setting and stops being a switch.</w:t>
+      </w:r>
+    </w:p>
+    <w:p>
+      <w:pPr>
+        <w:numPr>
+          <w:ilvl w:val="0"/>
+          <w:numId w:val="1002"/>
+        </w:numPr>
+        <w:pStyle w:val="Compact"/>
+      </w:pPr>
+      <w:r>
+        <w:t xml:space="preserve">We cut a simulated colony down to 2% survivors, the lowest level tested, and the bit still came back. Uneven splitting at division did not break it until about one molecule per cell.</w:t>
+      </w:r>
+    </w:p>
+    <w:p>
+      <w:pPr>
+        <w:numPr>
+          <w:ilvl w:val="0"/>
+          <w:numId w:val="1002"/>
+        </w:numPr>
+        <w:pStyle w:val="Compact"/>
+      </w:pPr>
+      <w:r>
+        <w:t xml:space="preserve">The colour reporter followed the genes exactly, even through damage and regrowth.</w:t>
+      </w:r>
+    </w:p>
+    <w:p>
+      <w:pPr>
+        <w:numPr>
+          <w:ilvl w:val="0"/>
+          <w:numId w:val="1002"/>
+        </w:numPr>
+        <w:pStyle w:val="Compact"/>
+      </w:pPr>
+      <w:r>
+        <w:t xml:space="preserve">The voltage reading was the hard part. The colony has its own potassium rhythm, which scrambles a quick reading. Averaging over about three hours fixes it but uses most of the time budget.</w:t>
+      </w:r>
+    </w:p>
+    <w:p>
+      <w:pPr>
+        <w:numPr>
+          <w:ilvl w:val="0"/>
+          <w:numId w:val="1002"/>
+        </w:numPr>
+        <w:pStyle w:val="Compact"/>
+      </w:pPr>
+      <w:r>
+        <w:t xml:space="preserve">A proposed "heal harder" circuit fixed the weak point in simulation. It has not been built.</w:t>
+      </w:r>
+    </w:p>
+    <w:p>
+      <w:pPr>
+        <w:pStyle w:val="FirstParagraph"/>
+      </w:pPr>
+      <w:r>
+        <w:rPr>
+          <w:bCs/>
+          <w:b/>
+        </w:rPr>
+        <w:t xml:space="preserve">7. What is proven, assumed, unknown.</w:t>
+      </w:r>
+      <w:r>
+        <w:t xml:space="preserve"> </w:t>
+      </w:r>
+      <w:r>
+        <w:t xml:space="preserve">Proven by others: toggle switches work in bacteria, biofilms carry electrical signals, and a voltage state has been written into this bacterium with light. Assumed by us: the noise levels and the molecule counts. Unknown: whether the state survives real damage and regrowth, and whether a gene can drive a real voltage.</w:t>
+      </w:r>
+    </w:p>
+    <w:p>
+      <w:pPr>
+        <w:pStyle w:val="BodyText"/>
+      </w:pPr>
+      <w:r>
+        <w:rPr>
+          <w:bCs/>
+          <w:b/>
+        </w:rPr>
+        <w:t xml:space="preserve">8. How it could work in practice.</w:t>
+      </w:r>
+      <w:r>
+        <w:t xml:space="preserve"> </w:t>
+      </w:r>
+      <w:r>
+        <w:t xml:space="preserve">Write a bit into the toggle. Damage the colony. The cells notice the damage and reinforce the state. The survivors regrow and carry it. Read it back by colour, later by voltage. The long-term picture is memory for places no one can repair, such as spacecraft. That is a concept, not a prototype.</w:t>
+      </w:r>
+    </w:p>
+    <w:p>
+      <w:pPr>
+        <w:pStyle w:val="BodyText"/>
+      </w:pPr>
+      <w:r>
+        <w:rPr>
+          <w:bCs/>
+          <w:b/>
+        </w:rPr>
+        <w:t xml:space="preserve">9. What we need.</w:t>
+      </w:r>
+      <w:r>
+        <w:t xml:space="preserve"> </w:t>
+      </w:r>
+      <w:r>
+        <w:t xml:space="preserve">Seven wet-lab experiments, run in order. Each is a go or no-go gate. Experiment 1 asks whether the switch really has two stable states in real cells. It costs about $2K to $5K and takes 6 to 10 weeks. A "no" there stops spending, and that cheap fast "no" is the design.</w:t>
+      </w:r>
+    </w:p>
+    <w:p>
+      <w:pPr>
+        <w:pStyle w:val="BodyText"/>
+      </w:pPr>
+      <w:r>
+        <w:rPr>
+          <w:bCs/>
+          <w:b/>
+        </w:rPr>
+        <w:t xml:space="preserve">10. How to close.</w:t>
+      </w:r>
+      <w:r>
+        <w:t xml:space="preserve"> </w:t>
+      </w:r>
+      <w:r>
+        <w:t xml:space="preserve">"We don't ask you to trust our simulations. We ask you to fund the cheapest test that replaces them."</w:t>
+      </w:r>
+    </w:p>
+    <w:p>
+      <w:r>
+        <w:pict>
+          <v:rect style="width:0;height:1.5pt" o:hralign="center" o:hrstd="t" o:hr="t"/>
+        </w:pict>
+      </w:r>
+    </w:p>
+    <w:bookmarkEnd w:id="23"/>
+    <w:bookmarkStart w:id="24" w:name="X6db03ac23b62fa02018bb6051eb1cd7f92faab0"/>
     <w:p>
       <w:pPr>
         <w:pStyle w:val="Heading2"/>
@@ -1503,8 +1995,8 @@
         </w:pict>
       </w:r>
     </w:p>
-    <w:bookmarkEnd w:id="23"/>
-    <w:bookmarkStart w:id="24" w:name="Xd1619c39485a2d60cc5c3b53b35c234d839200d"/>
+    <w:bookmarkEnd w:id="24"/>
+    <w:bookmarkStart w:id="25" w:name="Xd1619c39485a2d60cc5c3b53b35c234d839200d"/>
     <w:p>
       <w:pPr>
         <w:pStyle w:val="Heading2"/>
@@ -1535,7 +2027,7 @@
       <w:pPr>
         <w:numPr>
           <w:ilvl w:val="0"/>
-          <w:numId w:val="1002"/>
+          <w:numId w:val="1003"/>
         </w:numPr>
         <w:pStyle w:val="Compact"/>
       </w:pPr>
@@ -1563,7 +2055,7 @@
       <w:pPr>
         <w:numPr>
           <w:ilvl w:val="0"/>
-          <w:numId w:val="1002"/>
+          <w:numId w:val="1003"/>
         </w:numPr>
         <w:pStyle w:val="Compact"/>
       </w:pPr>
@@ -1619,7 +2111,7 @@
       <w:pPr>
         <w:numPr>
           <w:ilvl w:val="0"/>
-          <w:numId w:val="1002"/>
+          <w:numId w:val="1003"/>
         </w:numPr>
         <w:pStyle w:val="Compact"/>
       </w:pPr>
@@ -1647,7 +2139,7 @@
       <w:pPr>
         <w:numPr>
           <w:ilvl w:val="0"/>
-          <w:numId w:val="1002"/>
+          <w:numId w:val="1003"/>
         </w:numPr>
         <w:pStyle w:val="Compact"/>
       </w:pPr>
@@ -1681,7 +2173,7 @@
       <w:pPr>
         <w:numPr>
           <w:ilvl w:val="0"/>
-          <w:numId w:val="1002"/>
+          <w:numId w:val="1003"/>
         </w:numPr>
         <w:pStyle w:val="Compact"/>
       </w:pPr>
@@ -1792,8 +2284,8 @@
         </w:pict>
       </w:r>
     </w:p>
-    <w:bookmarkEnd w:id="24"/>
-    <w:bookmarkStart w:id="25" w:name="X556e81b738128b27cfac3b428a5f9754cfb7db6"/>
+    <w:bookmarkEnd w:id="25"/>
+    <w:bookmarkStart w:id="26" w:name="X556e81b738128b27cfac3b428a5f9754cfb7db6"/>
     <w:p>
       <w:pPr>
         <w:pStyle w:val="Heading2"/>
@@ -2617,8 +3109,8 @@
         </w:pict>
       </w:r>
     </w:p>
-    <w:bookmarkEnd w:id="25"/>
-    <w:bookmarkStart w:id="26" w:name="Xa20200ca6501d4e3041abb564f9f729603eff8f"/>
+    <w:bookmarkEnd w:id="26"/>
+    <w:bookmarkStart w:id="27" w:name="Xa20200ca6501d4e3041abb564f9f729603eff8f"/>
     <w:p>
       <w:pPr>
         <w:pStyle w:val="Heading2"/>
@@ -2631,7 +3123,7 @@
       <w:pPr>
         <w:numPr>
           <w:ilvl w:val="0"/>
-          <w:numId w:val="1003"/>
+          <w:numId w:val="1004"/>
         </w:numPr>
         <w:pStyle w:val="Compact"/>
       </w:pPr>
@@ -2665,7 +3157,7 @@
       <w:pPr>
         <w:numPr>
           <w:ilvl w:val="0"/>
-          <w:numId w:val="1003"/>
+          <w:numId w:val="1004"/>
         </w:numPr>
         <w:pStyle w:val="Compact"/>
       </w:pPr>
@@ -2704,7 +3196,7 @@
       <w:pPr>
         <w:numPr>
           <w:ilvl w:val="0"/>
-          <w:numId w:val="1003"/>
+          <w:numId w:val="1004"/>
         </w:numPr>
         <w:pStyle w:val="Compact"/>
       </w:pPr>
@@ -2732,7 +3224,7 @@
       <w:pPr>
         <w:numPr>
           <w:ilvl w:val="0"/>
-          <w:numId w:val="1003"/>
+          <w:numId w:val="1004"/>
         </w:numPr>
         <w:pStyle w:val="Compact"/>
       </w:pPr>
@@ -2764,8 +3256,8 @@
         </w:pict>
       </w:r>
     </w:p>
-    <w:bookmarkEnd w:id="26"/>
-    <w:bookmarkStart w:id="27" w:name="Xf0765efa5f89d8a32e209c0c7cd2a8f0c954ffd"/>
+    <w:bookmarkEnd w:id="27"/>
+    <w:bookmarkStart w:id="28" w:name="Xf0765efa5f89d8a32e209c0c7cd2a8f0c954ffd"/>
     <w:p>
       <w:pPr>
         <w:pStyle w:val="Heading2"/>
@@ -3255,7 +3747,7 @@
       <w:pPr>
         <w:numPr>
           <w:ilvl w:val="0"/>
-          <w:numId w:val="1004"/>
+          <w:numId w:val="1005"/>
         </w:numPr>
         <w:pStyle w:val="Compact"/>
       </w:pPr>
@@ -3267,7 +3759,7 @@
       <w:pPr>
         <w:numPr>
           <w:ilvl w:val="0"/>
-          <w:numId w:val="1004"/>
+          <w:numId w:val="1005"/>
         </w:numPr>
         <w:pStyle w:val="Compact"/>
       </w:pPr>
@@ -3279,7 +3771,7 @@
       <w:pPr>
         <w:numPr>
           <w:ilvl w:val="0"/>
-          <w:numId w:val="1004"/>
+          <w:numId w:val="1005"/>
         </w:numPr>
         <w:pStyle w:val="Compact"/>
       </w:pPr>
@@ -3416,8 +3908,8 @@
         </w:pict>
       </w:r>
     </w:p>
-    <w:bookmarkEnd w:id="27"/>
-    <w:bookmarkStart w:id="28" w:name="X5c2d4578e0a052c7172201cd5f2d8f3284ae962"/>
+    <w:bookmarkEnd w:id="28"/>
+    <w:bookmarkStart w:id="29" w:name="X5c2d4578e0a052c7172201cd5f2d8f3284ae962"/>
     <w:p>
       <w:pPr>
         <w:pStyle w:val="Heading2"/>
@@ -3953,8 +4445,8 @@
         </w:pict>
       </w:r>
     </w:p>
-    <w:bookmarkEnd w:id="28"/>
-    <w:bookmarkStart w:id="29" w:name="X5400ba72881644f210633f22f028ee8d96a0241"/>
+    <w:bookmarkEnd w:id="29"/>
+    <w:bookmarkStart w:id="30" w:name="X5400ba72881644f210633f22f028ee8d96a0241"/>
     <w:p>
       <w:pPr>
         <w:pStyle w:val="Heading2"/>
@@ -3979,7 +4471,7 @@
       <w:pPr>
         <w:numPr>
           <w:ilvl w:val="0"/>
-          <w:numId w:val="1005"/>
+          <w:numId w:val="1006"/>
         </w:numPr>
         <w:pStyle w:val="Compact"/>
       </w:pPr>
@@ -3991,7 +4483,7 @@
       <w:pPr>
         <w:numPr>
           <w:ilvl w:val="0"/>
-          <w:numId w:val="1005"/>
+          <w:numId w:val="1006"/>
         </w:numPr>
         <w:pStyle w:val="Compact"/>
       </w:pPr>
@@ -4003,7 +4495,7 @@
       <w:pPr>
         <w:numPr>
           <w:ilvl w:val="0"/>
-          <w:numId w:val="1005"/>
+          <w:numId w:val="1006"/>
         </w:numPr>
         <w:pStyle w:val="Compact"/>
       </w:pPr>
@@ -4023,7 +4515,7 @@
       <w:pPr>
         <w:numPr>
           <w:ilvl w:val="0"/>
-          <w:numId w:val="1006"/>
+          <w:numId w:val="1007"/>
         </w:numPr>
         <w:pStyle w:val="Compact"/>
       </w:pPr>
@@ -4045,7 +4537,7 @@
       <w:pPr>
         <w:numPr>
           <w:ilvl w:val="0"/>
-          <w:numId w:val="1006"/>
+          <w:numId w:val="1007"/>
         </w:numPr>
         <w:pStyle w:val="Compact"/>
       </w:pPr>
@@ -4067,7 +4559,7 @@
       <w:pPr>
         <w:numPr>
           <w:ilvl w:val="0"/>
-          <w:numId w:val="1006"/>
+          <w:numId w:val="1007"/>
         </w:numPr>
         <w:pStyle w:val="Compact"/>
       </w:pPr>
@@ -4089,7 +4581,7 @@
       <w:pPr>
         <w:numPr>
           <w:ilvl w:val="0"/>
-          <w:numId w:val="1006"/>
+          <w:numId w:val="1007"/>
         </w:numPr>
         <w:pStyle w:val="Compact"/>
       </w:pPr>
@@ -4111,7 +4603,7 @@
       <w:pPr>
         <w:numPr>
           <w:ilvl w:val="0"/>
-          <w:numId w:val="1006"/>
+          <w:numId w:val="1007"/>
         </w:numPr>
         <w:pStyle w:val="Compact"/>
       </w:pPr>
@@ -4153,7 +4645,7 @@
       <w:pPr>
         <w:numPr>
           <w:ilvl w:val="0"/>
-          <w:numId w:val="1007"/>
+          <w:numId w:val="1008"/>
         </w:numPr>
         <w:pStyle w:val="Compact"/>
       </w:pPr>
@@ -4175,7 +4667,7 @@
       <w:pPr>
         <w:numPr>
           <w:ilvl w:val="0"/>
-          <w:numId w:val="1007"/>
+          <w:numId w:val="1008"/>
         </w:numPr>
         <w:pStyle w:val="Compact"/>
       </w:pPr>
@@ -4197,7 +4689,7 @@
       <w:pPr>
         <w:numPr>
           <w:ilvl w:val="0"/>
-          <w:numId w:val="1007"/>
+          <w:numId w:val="1008"/>
         </w:numPr>
         <w:pStyle w:val="Compact"/>
       </w:pPr>
@@ -4219,7 +4711,7 @@
       <w:pPr>
         <w:numPr>
           <w:ilvl w:val="0"/>
-          <w:numId w:val="1007"/>
+          <w:numId w:val="1008"/>
         </w:numPr>
         <w:pStyle w:val="Compact"/>
       </w:pPr>
@@ -4254,7 +4746,7 @@
       <w:pPr>
         <w:numPr>
           <w:ilvl w:val="0"/>
-          <w:numId w:val="1007"/>
+          <w:numId w:val="1008"/>
         </w:numPr>
         <w:pStyle w:val="Compact"/>
       </w:pPr>
@@ -4297,8 +4789,8 @@
         </w:pict>
       </w:r>
     </w:p>
-    <w:bookmarkEnd w:id="29"/>
-    <w:bookmarkStart w:id="30" w:name="X7733ab87a12e9d405f7d4dcf7574c988c6e6c2f"/>
+    <w:bookmarkEnd w:id="30"/>
+    <w:bookmarkStart w:id="31" w:name="X7733ab87a12e9d405f7d4dcf7574c988c6e6c2f"/>
     <w:p>
       <w:pPr>
         <w:pStyle w:val="Heading2"/>
@@ -4323,7 +4815,7 @@
       <w:pPr>
         <w:numPr>
           <w:ilvl w:val="0"/>
-          <w:numId w:val="1008"/>
+          <w:numId w:val="1009"/>
         </w:numPr>
         <w:pStyle w:val="Compact"/>
       </w:pPr>
@@ -4348,7 +4840,7 @@
       <w:pPr>
         <w:numPr>
           <w:ilvl w:val="0"/>
-          <w:numId w:val="1008"/>
+          <w:numId w:val="1009"/>
         </w:numPr>
         <w:pStyle w:val="Compact"/>
       </w:pPr>
@@ -4360,7 +4852,7 @@
       <w:pPr>
         <w:numPr>
           <w:ilvl w:val="0"/>
-          <w:numId w:val="1008"/>
+          <w:numId w:val="1009"/>
         </w:numPr>
         <w:pStyle w:val="Compact"/>
       </w:pPr>
@@ -4372,7 +4864,7 @@
       <w:pPr>
         <w:numPr>
           <w:ilvl w:val="0"/>
-          <w:numId w:val="1008"/>
+          <w:numId w:val="1009"/>
         </w:numPr>
         <w:pStyle w:val="Compact"/>
       </w:pPr>
@@ -4402,7 +4894,7 @@
       <w:pPr>
         <w:numPr>
           <w:ilvl w:val="0"/>
-          <w:numId w:val="1009"/>
+          <w:numId w:val="1010"/>
         </w:numPr>
         <w:pStyle w:val="Compact"/>
       </w:pPr>
@@ -4424,7 +4916,7 @@
       <w:pPr>
         <w:numPr>
           <w:ilvl w:val="0"/>
-          <w:numId w:val="1009"/>
+          <w:numId w:val="1010"/>
         </w:numPr>
         <w:pStyle w:val="Compact"/>
       </w:pPr>
@@ -4446,7 +4938,7 @@
       <w:pPr>
         <w:numPr>
           <w:ilvl w:val="0"/>
-          <w:numId w:val="1009"/>
+          <w:numId w:val="1010"/>
         </w:numPr>
         <w:pStyle w:val="Compact"/>
       </w:pPr>
@@ -4468,7 +4960,7 @@
       <w:pPr>
         <w:numPr>
           <w:ilvl w:val="0"/>
-          <w:numId w:val="1009"/>
+          <w:numId w:val="1010"/>
         </w:numPr>
         <w:pStyle w:val="Compact"/>
       </w:pPr>
@@ -4490,7 +4982,7 @@
       <w:pPr>
         <w:numPr>
           <w:ilvl w:val="0"/>
-          <w:numId w:val="1009"/>
+          <w:numId w:val="1010"/>
         </w:numPr>
         <w:pStyle w:val="Compact"/>
       </w:pPr>
@@ -4533,8 +5025,8 @@
         </w:pict>
       </w:r>
     </w:p>
-    <w:bookmarkEnd w:id="30"/>
-    <w:bookmarkStart w:id="31" w:name="Xbef7b9c84c60ec7b0f5f6ce6fd8bf952040dff2"/>
+    <w:bookmarkEnd w:id="31"/>
+    <w:bookmarkStart w:id="32" w:name="Xbef7b9c84c60ec7b0f5f6ce6fd8bf952040dff2"/>
     <w:p>
       <w:pPr>
         <w:pStyle w:val="Heading2"/>
@@ -4547,7 +5039,7 @@
       <w:pPr>
         <w:numPr>
           <w:ilvl w:val="0"/>
-          <w:numId w:val="1010"/>
+          <w:numId w:val="1011"/>
         </w:numPr>
         <w:pStyle w:val="Compact"/>
       </w:pPr>
@@ -4559,7 +5051,7 @@
       <w:pPr>
         <w:numPr>
           <w:ilvl w:val="0"/>
-          <w:numId w:val="1010"/>
+          <w:numId w:val="1011"/>
         </w:numPr>
         <w:pStyle w:val="Compact"/>
       </w:pPr>
@@ -4571,7 +5063,7 @@
       <w:pPr>
         <w:numPr>
           <w:ilvl w:val="0"/>
-          <w:numId w:val="1010"/>
+          <w:numId w:val="1011"/>
         </w:numPr>
         <w:pStyle w:val="Compact"/>
       </w:pPr>
@@ -4595,7 +5087,7 @@
       <w:pPr>
         <w:numPr>
           <w:ilvl w:val="0"/>
-          <w:numId w:val="1010"/>
+          <w:numId w:val="1011"/>
         </w:numPr>
         <w:pStyle w:val="Compact"/>
       </w:pPr>
@@ -4607,7 +5099,7 @@
       <w:pPr>
         <w:numPr>
           <w:ilvl w:val="0"/>
-          <w:numId w:val="1010"/>
+          <w:numId w:val="1011"/>
         </w:numPr>
         <w:pStyle w:val="Compact"/>
       </w:pPr>
@@ -4619,7 +5111,7 @@
       <w:pPr>
         <w:numPr>
           <w:ilvl w:val="0"/>
-          <w:numId w:val="1010"/>
+          <w:numId w:val="1011"/>
         </w:numPr>
         <w:pStyle w:val="Compact"/>
       </w:pPr>
@@ -4631,7 +5123,7 @@
       <w:pPr>
         <w:numPr>
           <w:ilvl w:val="0"/>
-          <w:numId w:val="1010"/>
+          <w:numId w:val="1011"/>
         </w:numPr>
         <w:pStyle w:val="Compact"/>
       </w:pPr>
@@ -4643,7 +5135,7 @@
       <w:pPr>
         <w:numPr>
           <w:ilvl w:val="0"/>
-          <w:numId w:val="1010"/>
+          <w:numId w:val="1011"/>
         </w:numPr>
         <w:pStyle w:val="Compact"/>
       </w:pPr>
@@ -4658,8 +5150,8 @@
         </w:pict>
       </w:r>
     </w:p>
-    <w:bookmarkEnd w:id="31"/>
-    <w:bookmarkStart w:id="32" w:name="X726d46773f6d87b70607ed8f9fb1c7d830c494d"/>
+    <w:bookmarkEnd w:id="32"/>
+    <w:bookmarkStart w:id="33" w:name="X726d46773f6d87b70607ed8f9fb1c7d830c494d"/>
     <w:p>
       <w:pPr>
         <w:pStyle w:val="Heading2"/>
@@ -5034,8 +5526,8 @@
         </w:pict>
       </w:r>
     </w:p>
-    <w:bookmarkEnd w:id="32"/>
-    <w:bookmarkStart w:id="36" w:name="X0bc056492edbb8548de515718be6bda0ae3492a"/>
+    <w:bookmarkEnd w:id="33"/>
+    <w:bookmarkStart w:id="37" w:name="X0bc056492edbb8548de515718be6bda0ae3492a"/>
     <w:p>
       <w:pPr>
         <w:pStyle w:val="Heading2"/>
@@ -5086,7 +5578,7 @@
       <w:pPr>
         <w:numPr>
           <w:ilvl w:val="0"/>
-          <w:numId w:val="1011"/>
+          <w:numId w:val="1012"/>
         </w:numPr>
         <w:pStyle w:val="Compact"/>
       </w:pPr>
@@ -5104,7 +5596,7 @@
       <w:pPr>
         <w:numPr>
           <w:ilvl w:val="0"/>
-          <w:numId w:val="1011"/>
+          <w:numId w:val="1012"/>
         </w:numPr>
         <w:pStyle w:val="Compact"/>
       </w:pPr>
@@ -5122,7 +5614,7 @@
       <w:pPr>
         <w:numPr>
           <w:ilvl w:val="0"/>
-          <w:numId w:val="1011"/>
+          <w:numId w:val="1012"/>
         </w:numPr>
         <w:pStyle w:val="Compact"/>
       </w:pPr>
@@ -5162,7 +5654,7 @@
       <w:pPr>
         <w:numPr>
           <w:ilvl w:val="0"/>
-          <w:numId w:val="1012"/>
+          <w:numId w:val="1013"/>
         </w:numPr>
         <w:pStyle w:val="Compact"/>
       </w:pPr>
@@ -5180,7 +5672,7 @@
       <w:pPr>
         <w:numPr>
           <w:ilvl w:val="0"/>
-          <w:numId w:val="1012"/>
+          <w:numId w:val="1013"/>
         </w:numPr>
         <w:pStyle w:val="Compact"/>
       </w:pPr>
@@ -5192,7 +5684,7 @@
       <w:pPr>
         <w:numPr>
           <w:ilvl w:val="0"/>
-          <w:numId w:val="1012"/>
+          <w:numId w:val="1013"/>
         </w:numPr>
         <w:pStyle w:val="Compact"/>
       </w:pPr>
@@ -5202,7 +5694,7 @@
       <w:r>
         <w:t xml:space="preserve"> </w:t>
       </w:r>
-      <w:hyperlink r:id="rId33">
+      <w:hyperlink r:id="rId34">
         <w:r>
           <w:rPr>
             <w:rStyle w:val="Hyperlink"/>
@@ -5227,7 +5719,7 @@
       <w:pPr>
         <w:numPr>
           <w:ilvl w:val="0"/>
-          <w:numId w:val="1013"/>
+          <w:numId w:val="1014"/>
         </w:numPr>
         <w:pStyle w:val="Compact"/>
       </w:pPr>
@@ -5239,7 +5731,7 @@
       <w:pPr>
         <w:numPr>
           <w:ilvl w:val="0"/>
-          <w:numId w:val="1013"/>
+          <w:numId w:val="1014"/>
         </w:numPr>
         <w:pStyle w:val="Compact"/>
       </w:pPr>
@@ -5251,7 +5743,7 @@
       <w:pPr>
         <w:numPr>
           <w:ilvl w:val="0"/>
-          <w:numId w:val="1013"/>
+          <w:numId w:val="1014"/>
         </w:numPr>
         <w:pStyle w:val="Compact"/>
       </w:pPr>
@@ -5281,7 +5773,7 @@
       <w:pPr>
         <w:numPr>
           <w:ilvl w:val="0"/>
-          <w:numId w:val="1014"/>
+          <w:numId w:val="1015"/>
         </w:numPr>
         <w:pStyle w:val="Compact"/>
       </w:pPr>
@@ -5299,7 +5791,7 @@
       <w:pPr>
         <w:numPr>
           <w:ilvl w:val="0"/>
-          <w:numId w:val="1014"/>
+          <w:numId w:val="1015"/>
         </w:numPr>
         <w:pStyle w:val="Compact"/>
       </w:pPr>
@@ -5311,7 +5803,7 @@
       <w:pPr>
         <w:numPr>
           <w:ilvl w:val="0"/>
-          <w:numId w:val="1014"/>
+          <w:numId w:val="1015"/>
         </w:numPr>
         <w:pStyle w:val="Compact"/>
       </w:pPr>
@@ -5323,7 +5815,7 @@
       <w:pPr>
         <w:numPr>
           <w:ilvl w:val="0"/>
-          <w:numId w:val="1014"/>
+          <w:numId w:val="1015"/>
         </w:numPr>
         <w:pStyle w:val="Compact"/>
       </w:pPr>
@@ -5361,7 +5853,7 @@
       <w:pPr>
         <w:numPr>
           <w:ilvl w:val="0"/>
-          <w:numId w:val="1015"/>
+          <w:numId w:val="1016"/>
         </w:numPr>
         <w:pStyle w:val="Compact"/>
       </w:pPr>
@@ -5379,7 +5871,7 @@
       <w:pPr>
         <w:numPr>
           <w:ilvl w:val="0"/>
-          <w:numId w:val="1015"/>
+          <w:numId w:val="1016"/>
         </w:numPr>
         <w:pStyle w:val="Compact"/>
       </w:pPr>
@@ -5391,7 +5883,7 @@
       <w:pPr>
         <w:numPr>
           <w:ilvl w:val="0"/>
-          <w:numId w:val="1015"/>
+          <w:numId w:val="1016"/>
         </w:numPr>
         <w:pStyle w:val="Compact"/>
       </w:pPr>
@@ -5403,7 +5895,7 @@
       <w:pPr>
         <w:numPr>
           <w:ilvl w:val="0"/>
-          <w:numId w:val="1015"/>
+          <w:numId w:val="1016"/>
         </w:numPr>
         <w:pStyle w:val="Compact"/>
       </w:pPr>
@@ -5413,7 +5905,7 @@
       <w:r>
         <w:t xml:space="preserve"> </w:t>
       </w:r>
-      <w:hyperlink r:id="rId34">
+      <w:hyperlink r:id="rId35">
         <w:r>
           <w:rPr>
             <w:rStyle w:val="Hyperlink"/>
@@ -5438,7 +5930,7 @@
       <w:pPr>
         <w:numPr>
           <w:ilvl w:val="0"/>
-          <w:numId w:val="1016"/>
+          <w:numId w:val="1017"/>
         </w:numPr>
         <w:pStyle w:val="Compact"/>
       </w:pPr>
@@ -5460,7 +5952,7 @@
       <w:r>
         <w:t xml:space="preserve"> </w:t>
       </w:r>
-      <w:hyperlink r:id="rId35">
+      <w:hyperlink r:id="rId36">
         <w:r>
           <w:rPr>
             <w:rStyle w:val="Hyperlink"/>
@@ -5491,7 +5983,7 @@
       <w:pPr>
         <w:numPr>
           <w:ilvl w:val="0"/>
-          <w:numId w:val="1017"/>
+          <w:numId w:val="1018"/>
         </w:numPr>
         <w:pStyle w:val="Compact"/>
       </w:pPr>
@@ -5521,7 +6013,7 @@
       <w:pPr>
         <w:numPr>
           <w:ilvl w:val="0"/>
-          <w:numId w:val="1018"/>
+          <w:numId w:val="1019"/>
         </w:numPr>
         <w:pStyle w:val="Compact"/>
       </w:pPr>
@@ -5566,8 +6058,8 @@
         </w:pict>
       </w:r>
     </w:p>
-    <w:bookmarkEnd w:id="36"/>
-    <w:bookmarkStart w:id="37" w:name="Xfe20e0d0917bd277929d48cd776bf75a811f542"/>
+    <w:bookmarkEnd w:id="37"/>
+    <w:bookmarkStart w:id="38" w:name="Xfe20e0d0917bd277929d48cd776bf75a811f542"/>
     <w:p>
       <w:pPr>
         <w:pStyle w:val="Heading2"/>
@@ -5580,7 +6072,7 @@
       <w:pPr>
         <w:numPr>
           <w:ilvl w:val="0"/>
-          <w:numId w:val="1019"/>
+          <w:numId w:val="1020"/>
         </w:numPr>
         <w:pStyle w:val="Compact"/>
       </w:pPr>
@@ -5602,7 +6094,7 @@
       <w:pPr>
         <w:numPr>
           <w:ilvl w:val="0"/>
-          <w:numId w:val="1019"/>
+          <w:numId w:val="1020"/>
         </w:numPr>
         <w:pStyle w:val="Compact"/>
       </w:pPr>
@@ -5624,7 +6116,7 @@
       <w:pPr>
         <w:numPr>
           <w:ilvl w:val="0"/>
-          <w:numId w:val="1019"/>
+          <w:numId w:val="1020"/>
         </w:numPr>
         <w:pStyle w:val="Compact"/>
       </w:pPr>
@@ -5646,7 +6138,7 @@
       <w:pPr>
         <w:numPr>
           <w:ilvl w:val="0"/>
-          <w:numId w:val="1019"/>
+          <w:numId w:val="1020"/>
         </w:numPr>
         <w:pStyle w:val="Compact"/>
       </w:pPr>
@@ -5680,7 +6172,7 @@
       <w:pPr>
         <w:numPr>
           <w:ilvl w:val="0"/>
-          <w:numId w:val="1019"/>
+          <w:numId w:val="1020"/>
         </w:numPr>
         <w:pStyle w:val="Compact"/>
       </w:pPr>
@@ -5702,7 +6194,7 @@
       <w:pPr>
         <w:numPr>
           <w:ilvl w:val="0"/>
-          <w:numId w:val="1019"/>
+          <w:numId w:val="1020"/>
         </w:numPr>
         <w:pStyle w:val="Compact"/>
       </w:pPr>
@@ -5724,7 +6216,7 @@
       <w:pPr>
         <w:numPr>
           <w:ilvl w:val="0"/>
-          <w:numId w:val="1019"/>
+          <w:numId w:val="1020"/>
         </w:numPr>
         <w:pStyle w:val="Compact"/>
       </w:pPr>
@@ -5746,7 +6238,7 @@
       <w:pPr>
         <w:numPr>
           <w:ilvl w:val="0"/>
-          <w:numId w:val="1019"/>
+          <w:numId w:val="1020"/>
         </w:numPr>
         <w:pStyle w:val="Compact"/>
       </w:pPr>
@@ -5768,7 +6260,7 @@
       <w:pPr>
         <w:numPr>
           <w:ilvl w:val="0"/>
-          <w:numId w:val="1019"/>
+          <w:numId w:val="1020"/>
         </w:numPr>
         <w:pStyle w:val="Compact"/>
       </w:pPr>
@@ -5786,8 +6278,8 @@
         <w:t xml:space="preserve">a clean "no". Worth money because it saves money.</w:t>
       </w:r>
     </w:p>
-    <w:bookmarkEnd w:id="37"/>
     <w:bookmarkEnd w:id="38"/>
+    <w:bookmarkEnd w:id="39"/>
     <w:sectPr/>
   </w:body>
 </w:document>
@@ -6062,6 +6554,9 @@
     <w:abstractNumId w:val="991"/>
   </w:num>
   <w:num w:numId="1002">
+    <w:abstractNumId w:val="991"/>
+  </w:num>
+  <w:num w:numId="1003">
     <w:abstractNumId w:val="99411"/>
     <w:lvlOverride w:ilvl="0">
       <w:startOverride w:val="1"/>
@@ -6091,10 +6586,10 @@
       <w:startOverride w:val="1"/>
     </w:lvlOverride>
   </w:num>
-  <w:num w:numId="1003">
+  <w:num w:numId="1004">
     <w:abstractNumId w:val="991"/>
   </w:num>
-  <w:num w:numId="1004">
+  <w:num w:numId="1005">
     <w:abstractNumId w:val="99411"/>
     <w:lvlOverride w:ilvl="0">
       <w:startOverride w:val="1"/>
@@ -6124,13 +6619,13 @@
       <w:startOverride w:val="1"/>
     </w:lvlOverride>
   </w:num>
-  <w:num w:numId="1005">
-    <w:abstractNumId w:val="991"/>
-  </w:num>
   <w:num w:numId="1006">
     <w:abstractNumId w:val="991"/>
   </w:num>
   <w:num w:numId="1007">
+    <w:abstractNumId w:val="991"/>
+  </w:num>
+  <w:num w:numId="1008">
     <w:abstractNumId w:val="99411"/>
     <w:lvlOverride w:ilvl="0">
       <w:startOverride w:val="1"/>
@@ -6160,10 +6655,10 @@
       <w:startOverride w:val="1"/>
     </w:lvlOverride>
   </w:num>
-  <w:num w:numId="1008">
+  <w:num w:numId="1009">
     <w:abstractNumId w:val="991"/>
   </w:num>
-  <w:num w:numId="1009">
+  <w:num w:numId="1010">
     <w:abstractNumId w:val="99411"/>
     <w:lvlOverride w:ilvl="0">
       <w:startOverride w:val="1"/>
@@ -6193,9 +6688,6 @@
       <w:startOverride w:val="1"/>
     </w:lvlOverride>
   </w:num>
-  <w:num w:numId="1010">
-    <w:abstractNumId w:val="991"/>
-  </w:num>
   <w:num w:numId="1011">
     <w:abstractNumId w:val="991"/>
   </w:num>
@@ -6221,6 +6713,9 @@
     <w:abstractNumId w:val="991"/>
   </w:num>
   <w:num w:numId="1019">
+    <w:abstractNumId w:val="991"/>
+  </w:num>
+  <w:num w:numId="1020">
     <w:abstractNumId w:val="991"/>
   </w:num>
 </w:numbering>

</xml_diff>